<commit_message>
Style Word abstract and catalog
</commit_message>
<xml_diff>
--- a/docs/CS599_大作业报告.docx
+++ b/docs/CS599_大作业报告.docx
@@ -529,6 +529,7 @@
     <w:p>
       <w:pPr>
         <w:pStyle w:val="Heading1"/>
+        <w:spacing w:before="1000" w:after="480"/>
         <w:jc w:val="center"/>
       </w:pPr>
       <w:r>
@@ -541,25 +542,508 @@
       </w:r>
     </w:p>
     <w:p>
+      <w:pPr>
+        <w:tabs>
+          <w:tab w:pos="8731" w:val="right" w:leader="dot"/>
+        </w:tabs>
+        <w:spacing w:after="160"/>
+        <w:ind w:left="0"/>
+      </w:pPr>
       <w:r>
-        <w:fldChar w:fldCharType="begin"/>
-        <w:instrText xml:space="preserve">TOC \o "1-3" \h \z \u</w:instrText>
-        <w:fldChar w:fldCharType="separate"/>
-        <w:t>右键更新域以生成目录</w:t>
-        <w:fldChar w:fldCharType="end"/>
+        <w:rPr>
+          <w:rFonts w:ascii="宋体" w:hAnsi="宋体" w:eastAsia="宋体"/>
+          <w:b/>
+          <w:color w:val="111827"/>
+          <w:sz w:val="24"/>
+        </w:rPr>
+        <w:t>目录</w:t>
+        <w:tab/>
+        <w:t>2</w:t>
       </w:r>
     </w:p>
     <w:p>
       <w:pPr>
-        <w:jc w:val="center"/>
+        <w:tabs>
+          <w:tab w:pos="8731" w:val="right" w:leader="dot"/>
+        </w:tabs>
+        <w:spacing w:after="160"/>
+        <w:ind w:left="0"/>
       </w:pPr>
       <w:r>
         <w:rPr>
           <w:rFonts w:ascii="宋体" w:hAnsi="宋体" w:eastAsia="宋体"/>
-          <w:color w:val="6B7280"/>
-          <w:sz w:val="21"/>
+          <w:b/>
+          <w:color w:val="111827"/>
+          <w:sz w:val="24"/>
         </w:rPr>
-        <w:t>提示：在 Word 中右键目录区域选择“更新域”，即可生成正式页码目录。左侧导航窗格可直接按标题层级浏览。</w:t>
+        <w:t>摘要</w:t>
+        <w:tab/>
+        <w:t>3</w:t>
+      </w:r>
+    </w:p>
+    <w:p>
+      <w:pPr>
+        <w:tabs>
+          <w:tab w:pos="8731" w:val="right" w:leader="dot"/>
+        </w:tabs>
+        <w:spacing w:after="160"/>
+        <w:ind w:left="0"/>
+      </w:pPr>
+      <w:r>
+        <w:rPr>
+          <w:rFonts w:ascii="宋体" w:hAnsi="宋体" w:eastAsia="宋体"/>
+          <w:b/>
+          <w:color w:val="111827"/>
+          <w:sz w:val="24"/>
+        </w:rPr>
+        <w:t>一、选题背景与设计思想</w:t>
+        <w:tab/>
+        <w:t>4</w:t>
+      </w:r>
+    </w:p>
+    <w:p>
+      <w:pPr>
+        <w:tabs>
+          <w:tab w:pos="8731" w:val="right" w:leader="dot"/>
+        </w:tabs>
+        <w:spacing w:after="160"/>
+        <w:ind w:left="0"/>
+      </w:pPr>
+      <w:r>
+        <w:rPr>
+          <w:rFonts w:ascii="宋体" w:hAnsi="宋体" w:eastAsia="宋体"/>
+          <w:b/>
+          <w:color w:val="111827"/>
+          <w:sz w:val="24"/>
+        </w:rPr>
+        <w:t>二、Specs 规格设计</w:t>
+        <w:tab/>
+        <w:t>5</w:t>
+      </w:r>
+    </w:p>
+    <w:p>
+      <w:pPr>
+        <w:tabs>
+          <w:tab w:pos="8731" w:val="right" w:leader="dot"/>
+        </w:tabs>
+        <w:spacing w:after="160"/>
+        <w:ind w:left="420"/>
+      </w:pPr>
+      <w:r>
+        <w:rPr>
+          <w:rFonts w:ascii="宋体" w:hAnsi="宋体" w:eastAsia="宋体"/>
+          <w:b w:val="0"/>
+          <w:color w:val="111827"/>
+          <w:sz w:val="24"/>
+        </w:rPr>
+        <w:t>2.1 Product Spec</w:t>
+        <w:tab/>
+        <w:t>5</w:t>
+      </w:r>
+    </w:p>
+    <w:p>
+      <w:pPr>
+        <w:tabs>
+          <w:tab w:pos="8731" w:val="right" w:leader="dot"/>
+        </w:tabs>
+        <w:spacing w:after="160"/>
+        <w:ind w:left="420"/>
+      </w:pPr>
+      <w:r>
+        <w:rPr>
+          <w:rFonts w:ascii="宋体" w:hAnsi="宋体" w:eastAsia="宋体"/>
+          <w:b w:val="0"/>
+          <w:color w:val="111827"/>
+          <w:sz w:val="24"/>
+        </w:rPr>
+        <w:t>2.2 API Spec</w:t>
+        <w:tab/>
+        <w:t>7</w:t>
+      </w:r>
+    </w:p>
+    <w:p>
+      <w:pPr>
+        <w:tabs>
+          <w:tab w:pos="8731" w:val="right" w:leader="dot"/>
+        </w:tabs>
+        <w:spacing w:after="160"/>
+        <w:ind w:left="420"/>
+      </w:pPr>
+      <w:r>
+        <w:rPr>
+          <w:rFonts w:ascii="宋体" w:hAnsi="宋体" w:eastAsia="宋体"/>
+          <w:b w:val="0"/>
+          <w:color w:val="111827"/>
+          <w:sz w:val="24"/>
+        </w:rPr>
+        <w:t>2.3 SDD 核心</w:t>
+        <w:tab/>
+        <w:t>8</w:t>
+      </w:r>
+    </w:p>
+    <w:p>
+      <w:pPr>
+        <w:tabs>
+          <w:tab w:pos="8731" w:val="right" w:leader="dot"/>
+        </w:tabs>
+        <w:spacing w:after="160"/>
+        <w:ind w:left="0"/>
+      </w:pPr>
+      <w:r>
+        <w:rPr>
+          <w:rFonts w:ascii="宋体" w:hAnsi="宋体" w:eastAsia="宋体"/>
+          <w:b/>
+          <w:color w:val="111827"/>
+          <w:sz w:val="24"/>
+        </w:rPr>
+        <w:t>三、系统架构与设计</w:t>
+        <w:tab/>
+        <w:t>9</w:t>
+      </w:r>
+    </w:p>
+    <w:p>
+      <w:pPr>
+        <w:tabs>
+          <w:tab w:pos="8731" w:val="right" w:leader="dot"/>
+        </w:tabs>
+        <w:spacing w:after="160"/>
+        <w:ind w:left="420"/>
+      </w:pPr>
+      <w:r>
+        <w:rPr>
+          <w:rFonts w:ascii="宋体" w:hAnsi="宋体" w:eastAsia="宋体"/>
+          <w:b w:val="0"/>
+          <w:color w:val="111827"/>
+          <w:sz w:val="24"/>
+        </w:rPr>
+        <w:t>3.1 总体架构</w:t>
+        <w:tab/>
+        <w:t>9</w:t>
+      </w:r>
+    </w:p>
+    <w:p>
+      <w:pPr>
+        <w:tabs>
+          <w:tab w:pos="8731" w:val="right" w:leader="dot"/>
+        </w:tabs>
+        <w:spacing w:after="160"/>
+        <w:ind w:left="420"/>
+      </w:pPr>
+      <w:r>
+        <w:rPr>
+          <w:rFonts w:ascii="宋体" w:hAnsi="宋体" w:eastAsia="宋体"/>
+          <w:b w:val="0"/>
+          <w:color w:val="111827"/>
+          <w:sz w:val="24"/>
+        </w:rPr>
+        <w:t>3.2 Agent 交互流程</w:t>
+        <w:tab/>
+        <w:t>10</w:t>
+      </w:r>
+    </w:p>
+    <w:p>
+      <w:pPr>
+        <w:tabs>
+          <w:tab w:pos="8731" w:val="right" w:leader="dot"/>
+        </w:tabs>
+        <w:spacing w:after="160"/>
+        <w:ind w:left="420"/>
+      </w:pPr>
+      <w:r>
+        <w:rPr>
+          <w:rFonts w:ascii="宋体" w:hAnsi="宋体" w:eastAsia="宋体"/>
+          <w:b w:val="0"/>
+          <w:color w:val="111827"/>
+          <w:sz w:val="24"/>
+        </w:rPr>
+        <w:t>3.3 数据设计</w:t>
+        <w:tab/>
+        <w:t>12</w:t>
+      </w:r>
+    </w:p>
+    <w:p>
+      <w:pPr>
+        <w:tabs>
+          <w:tab w:pos="8731" w:val="right" w:leader="dot"/>
+        </w:tabs>
+        <w:spacing w:after="160"/>
+        <w:ind w:left="0"/>
+      </w:pPr>
+      <w:r>
+        <w:rPr>
+          <w:rFonts w:ascii="宋体" w:hAnsi="宋体" w:eastAsia="宋体"/>
+          <w:b/>
+          <w:color w:val="111827"/>
+          <w:sz w:val="24"/>
+        </w:rPr>
+        <w:t>四、关键实现与代码展示</w:t>
+        <w:tab/>
+        <w:t>13</w:t>
+      </w:r>
+    </w:p>
+    <w:p>
+      <w:pPr>
+        <w:tabs>
+          <w:tab w:pos="8731" w:val="right" w:leader="dot"/>
+        </w:tabs>
+        <w:spacing w:after="160"/>
+        <w:ind w:left="420"/>
+      </w:pPr>
+      <w:r>
+        <w:rPr>
+          <w:rFonts w:ascii="宋体" w:hAnsi="宋体" w:eastAsia="宋体"/>
+          <w:b w:val="0"/>
+          <w:color w:val="111827"/>
+          <w:sz w:val="24"/>
+        </w:rPr>
+        <w:t>4.1 LegalAgentService</w:t>
+        <w:tab/>
+        <w:t>13</w:t>
+      </w:r>
+    </w:p>
+    <w:p>
+      <w:pPr>
+        <w:tabs>
+          <w:tab w:pos="8731" w:val="right" w:leader="dot"/>
+        </w:tabs>
+        <w:spacing w:after="160"/>
+        <w:ind w:left="420"/>
+      </w:pPr>
+      <w:r>
+        <w:rPr>
+          <w:rFonts w:ascii="宋体" w:hAnsi="宋体" w:eastAsia="宋体"/>
+          <w:b w:val="0"/>
+          <w:color w:val="111827"/>
+          <w:sz w:val="24"/>
+        </w:rPr>
+        <w:t>4.2 RAG 与知识库</w:t>
+        <w:tab/>
+        <w:t>14</w:t>
+      </w:r>
+    </w:p>
+    <w:p>
+      <w:pPr>
+        <w:tabs>
+          <w:tab w:pos="8731" w:val="right" w:leader="dot"/>
+        </w:tabs>
+        <w:spacing w:after="160"/>
+        <w:ind w:left="420"/>
+      </w:pPr>
+      <w:r>
+        <w:rPr>
+          <w:rFonts w:ascii="宋体" w:hAnsi="宋体" w:eastAsia="宋体"/>
+          <w:b w:val="0"/>
+          <w:color w:val="111827"/>
+          <w:sz w:val="24"/>
+        </w:rPr>
+        <w:t>4.3 前端交互</w:t>
+        <w:tab/>
+        <w:t>15</w:t>
+      </w:r>
+    </w:p>
+    <w:p>
+      <w:pPr>
+        <w:tabs>
+          <w:tab w:pos="8731" w:val="right" w:leader="dot"/>
+        </w:tabs>
+        <w:spacing w:after="160"/>
+        <w:ind w:left="420"/>
+      </w:pPr>
+      <w:r>
+        <w:rPr>
+          <w:rFonts w:ascii="宋体" w:hAnsi="宋体" w:eastAsia="宋体"/>
+          <w:b w:val="0"/>
+          <w:color w:val="111827"/>
+          <w:sz w:val="24"/>
+        </w:rPr>
+        <w:t>4.4 安全边界</w:t>
+        <w:tab/>
+        <w:t>16</w:t>
+      </w:r>
+    </w:p>
+    <w:p>
+      <w:pPr>
+        <w:tabs>
+          <w:tab w:pos="8731" w:val="right" w:leader="dot"/>
+        </w:tabs>
+        <w:spacing w:after="160"/>
+        <w:ind w:left="0"/>
+      </w:pPr>
+      <w:r>
+        <w:rPr>
+          <w:rFonts w:ascii="宋体" w:hAnsi="宋体" w:eastAsia="宋体"/>
+          <w:b/>
+          <w:color w:val="111827"/>
+          <w:sz w:val="24"/>
+        </w:rPr>
+        <w:t>五、测试与评估</w:t>
+        <w:tab/>
+        <w:t>17</w:t>
+      </w:r>
+    </w:p>
+    <w:p>
+      <w:pPr>
+        <w:tabs>
+          <w:tab w:pos="8731" w:val="right" w:leader="dot"/>
+        </w:tabs>
+        <w:spacing w:after="160"/>
+        <w:ind w:left="420"/>
+      </w:pPr>
+      <w:r>
+        <w:rPr>
+          <w:rFonts w:ascii="宋体" w:hAnsi="宋体" w:eastAsia="宋体"/>
+          <w:b w:val="0"/>
+          <w:color w:val="111827"/>
+          <w:sz w:val="24"/>
+        </w:rPr>
+        <w:t>5.1 功能测试</w:t>
+        <w:tab/>
+        <w:t>17</w:t>
+      </w:r>
+    </w:p>
+    <w:p>
+      <w:pPr>
+        <w:tabs>
+          <w:tab w:pos="8731" w:val="right" w:leader="dot"/>
+        </w:tabs>
+        <w:spacing w:after="160"/>
+        <w:ind w:left="420"/>
+      </w:pPr>
+      <w:r>
+        <w:rPr>
+          <w:rFonts w:ascii="宋体" w:hAnsi="宋体" w:eastAsia="宋体"/>
+          <w:b w:val="0"/>
+          <w:color w:val="111827"/>
+          <w:sz w:val="24"/>
+        </w:rPr>
+        <w:t>5.2 构建测试</w:t>
+        <w:tab/>
+        <w:t>18</w:t>
+      </w:r>
+    </w:p>
+    <w:p>
+      <w:r>
+        <w:br w:type="page"/>
+      </w:r>
+    </w:p>
+    <w:p>
+      <w:pPr>
+        <w:tabs>
+          <w:tab w:pos="8731" w:val="right" w:leader="dot"/>
+        </w:tabs>
+        <w:spacing w:after="160"/>
+        <w:ind w:left="420"/>
+      </w:pPr>
+      <w:r>
+        <w:rPr>
+          <w:rFonts w:ascii="宋体" w:hAnsi="宋体" w:eastAsia="宋体"/>
+          <w:b w:val="0"/>
+          <w:color w:val="111827"/>
+          <w:sz w:val="24"/>
+        </w:rPr>
+        <w:t>5.3 Demo 评估</w:t>
+        <w:tab/>
+        <w:t>18</w:t>
+      </w:r>
+    </w:p>
+    <w:p>
+      <w:pPr>
+        <w:tabs>
+          <w:tab w:pos="8731" w:val="right" w:leader="dot"/>
+        </w:tabs>
+        <w:spacing w:after="160"/>
+        <w:ind w:left="0"/>
+      </w:pPr>
+      <w:r>
+        <w:rPr>
+          <w:rFonts w:ascii="宋体" w:hAnsi="宋体" w:eastAsia="宋体"/>
+          <w:b/>
+          <w:color w:val="111827"/>
+          <w:sz w:val="24"/>
+        </w:rPr>
+        <w:t>六、系统升级与扩展</w:t>
+        <w:tab/>
+        <w:t>19</w:t>
+      </w:r>
+    </w:p>
+    <w:p>
+      <w:pPr>
+        <w:tabs>
+          <w:tab w:pos="8731" w:val="right" w:leader="dot"/>
+        </w:tabs>
+        <w:spacing w:after="160"/>
+        <w:ind w:left="0"/>
+      </w:pPr>
+      <w:r>
+        <w:rPr>
+          <w:rFonts w:ascii="宋体" w:hAnsi="宋体" w:eastAsia="宋体"/>
+          <w:b/>
+          <w:color w:val="111827"/>
+          <w:sz w:val="24"/>
+        </w:rPr>
+        <w:t>七、课程总结</w:t>
+        <w:tab/>
+        <w:t>20</w:t>
+      </w:r>
+    </w:p>
+    <w:p>
+      <w:pPr>
+        <w:tabs>
+          <w:tab w:pos="8731" w:val="right" w:leader="dot"/>
+        </w:tabs>
+        <w:spacing w:after="160"/>
+        <w:ind w:left="0"/>
+      </w:pPr>
+      <w:r>
+        <w:rPr>
+          <w:rFonts w:ascii="宋体" w:hAnsi="宋体" w:eastAsia="宋体"/>
+          <w:b/>
+          <w:color w:val="111827"/>
+          <w:sz w:val="24"/>
+        </w:rPr>
+        <w:t>附录：运行方式</w:t>
+        <w:tab/>
+        <w:t>21</w:t>
+      </w:r>
+    </w:p>
+    <w:p>
+      <w:pPr>
+        <w:tabs>
+          <w:tab w:pos="8731" w:val="right" w:leader="dot"/>
+        </w:tabs>
+        <w:spacing w:after="160"/>
+        <w:ind w:left="420"/>
+      </w:pPr>
+      <w:r>
+        <w:rPr>
+          <w:rFonts w:ascii="宋体" w:hAnsi="宋体" w:eastAsia="宋体"/>
+          <w:b w:val="0"/>
+          <w:color w:val="111827"/>
+          <w:sz w:val="24"/>
+        </w:rPr>
+        <w:t>附录 A：项目文件与交付物对照</w:t>
+        <w:tab/>
+        <w:t>21</w:t>
+      </w:r>
+    </w:p>
+    <w:p>
+      <w:pPr>
+        <w:tabs>
+          <w:tab w:pos="8731" w:val="right" w:leader="dot"/>
+        </w:tabs>
+        <w:spacing w:after="160"/>
+        <w:ind w:left="420"/>
+      </w:pPr>
+      <w:r>
+        <w:rPr>
+          <w:rFonts w:ascii="宋体" w:hAnsi="宋体" w:eastAsia="宋体"/>
+          <w:b w:val="0"/>
+          <w:color w:val="111827"/>
+          <w:sz w:val="24"/>
+        </w:rPr>
+        <w:t>附录 B：关键术语说明</w:t>
+        <w:tab/>
+        <w:t>22</w:t>
       </w:r>
     </w:p>
     <w:p>
@@ -1083,6 +1567,8 @@
     <w:p>
       <w:pPr>
         <w:pStyle w:val="Heading1"/>
+        <w:spacing w:before="1000" w:after="440"/>
+        <w:jc w:val="center"/>
       </w:pPr>
       <w:r>
         <w:rPr>

</xml_diff>

<commit_message>
Add clickable Word report catalog
</commit_message>
<xml_diff>
--- a/docs/CS599_大作业报告.docx
+++ b/docs/CS599_大作业报告.docx
@@ -527,6 +527,7 @@
       </w:r>
     </w:p>
     <w:p>
+      <w:bookmarkStart w:id="1" w:name="toc"/>
       <w:pPr>
         <w:pStyle w:val="Heading1"/>
         <w:spacing w:before="1000" w:after="480"/>
@@ -540,6 +541,7 @@
         </w:rPr>
         <w:t>目录</w:t>
       </w:r>
+      <w:bookmarkEnd w:id="1"/>
     </w:p>
     <w:p>
       <w:pPr>
@@ -549,17 +551,21 @@
         <w:spacing w:after="160"/>
         <w:ind w:left="0"/>
       </w:pPr>
-      <w:r>
-        <w:rPr>
-          <w:rFonts w:ascii="宋体" w:hAnsi="宋体" w:eastAsia="宋体"/>
-          <w:b/>
-          <w:color w:val="111827"/>
-          <w:sz w:val="24"/>
-        </w:rPr>
-        <w:t>目录</w:t>
-        <w:tab/>
-        <w:t>2</w:t>
-      </w:r>
+      <w:hyperlink w:anchor="toc" w:history="1">
+        <w:r>
+          <w:rPr>
+            <w:rStyle w:val="Hyperlink"/>
+            <w:rFonts w:ascii="宋体" w:hAnsi="宋体" w:eastAsia="宋体"/>
+            <w:sz w:val="24"/>
+            <w:szCs w:val="24"/>
+            <w:color w:val="111827"/>
+            <w:b/>
+            <w:bCs/>
+            <w:u w:val="none"/>
+          </w:rPr>
+          <w:t xml:space="preserve">目录	2</w:t>
+        </w:r>
+      </w:hyperlink>
     </w:p>
     <w:p>
       <w:pPr>
@@ -569,17 +575,21 @@
         <w:spacing w:after="160"/>
         <w:ind w:left="0"/>
       </w:pPr>
-      <w:r>
-        <w:rPr>
-          <w:rFonts w:ascii="宋体" w:hAnsi="宋体" w:eastAsia="宋体"/>
-          <w:b/>
-          <w:color w:val="111827"/>
-          <w:sz w:val="24"/>
-        </w:rPr>
-        <w:t>摘要</w:t>
-        <w:tab/>
-        <w:t>3</w:t>
-      </w:r>
+      <w:hyperlink w:anchor="bm_h_1" w:history="1">
+        <w:r>
+          <w:rPr>
+            <w:rStyle w:val="Hyperlink"/>
+            <w:rFonts w:ascii="宋体" w:hAnsi="宋体" w:eastAsia="宋体"/>
+            <w:sz w:val="24"/>
+            <w:szCs w:val="24"/>
+            <w:color w:val="111827"/>
+            <w:b/>
+            <w:bCs/>
+            <w:u w:val="none"/>
+          </w:rPr>
+          <w:t xml:space="preserve">摘要	3</w:t>
+        </w:r>
+      </w:hyperlink>
     </w:p>
     <w:p>
       <w:pPr>
@@ -589,17 +599,21 @@
         <w:spacing w:after="160"/>
         <w:ind w:left="0"/>
       </w:pPr>
-      <w:r>
-        <w:rPr>
-          <w:rFonts w:ascii="宋体" w:hAnsi="宋体" w:eastAsia="宋体"/>
-          <w:b/>
-          <w:color w:val="111827"/>
-          <w:sz w:val="24"/>
-        </w:rPr>
-        <w:t>一、选题背景与设计思想</w:t>
-        <w:tab/>
-        <w:t>4</w:t>
-      </w:r>
+      <w:hyperlink w:anchor="bm_h_2" w:history="1">
+        <w:r>
+          <w:rPr>
+            <w:rStyle w:val="Hyperlink"/>
+            <w:rFonts w:ascii="宋体" w:hAnsi="宋体" w:eastAsia="宋体"/>
+            <w:sz w:val="24"/>
+            <w:szCs w:val="24"/>
+            <w:color w:val="111827"/>
+            <w:b/>
+            <w:bCs/>
+            <w:u w:val="none"/>
+          </w:rPr>
+          <w:t xml:space="preserve">一、选题背景与设计思想	4</w:t>
+        </w:r>
+      </w:hyperlink>
     </w:p>
     <w:p>
       <w:pPr>
@@ -609,17 +623,21 @@
         <w:spacing w:after="160"/>
         <w:ind w:left="0"/>
       </w:pPr>
-      <w:r>
-        <w:rPr>
-          <w:rFonts w:ascii="宋体" w:hAnsi="宋体" w:eastAsia="宋体"/>
-          <w:b/>
-          <w:color w:val="111827"/>
-          <w:sz w:val="24"/>
-        </w:rPr>
-        <w:t>二、Specs 规格设计</w:t>
-        <w:tab/>
-        <w:t>5</w:t>
-      </w:r>
+      <w:hyperlink w:anchor="bm_h_3" w:history="1">
+        <w:r>
+          <w:rPr>
+            <w:rStyle w:val="Hyperlink"/>
+            <w:rFonts w:ascii="宋体" w:hAnsi="宋体" w:eastAsia="宋体"/>
+            <w:sz w:val="24"/>
+            <w:szCs w:val="24"/>
+            <w:color w:val="111827"/>
+            <w:b/>
+            <w:bCs/>
+            <w:u w:val="none"/>
+          </w:rPr>
+          <w:t xml:space="preserve">二、Specs 规格设计	5</w:t>
+        </w:r>
+      </w:hyperlink>
     </w:p>
     <w:p>
       <w:pPr>
@@ -629,17 +647,19 @@
         <w:spacing w:after="160"/>
         <w:ind w:left="420"/>
       </w:pPr>
-      <w:r>
-        <w:rPr>
-          <w:rFonts w:ascii="宋体" w:hAnsi="宋体" w:eastAsia="宋体"/>
-          <w:b w:val="0"/>
-          <w:color w:val="111827"/>
-          <w:sz w:val="24"/>
-        </w:rPr>
-        <w:t>2.1 Product Spec</w:t>
-        <w:tab/>
-        <w:t>5</w:t>
-      </w:r>
+      <w:hyperlink w:anchor="bm_h_4" w:history="1">
+        <w:r>
+          <w:rPr>
+            <w:rStyle w:val="Hyperlink"/>
+            <w:rFonts w:ascii="宋体" w:hAnsi="宋体" w:eastAsia="宋体"/>
+            <w:sz w:val="24"/>
+            <w:szCs w:val="24"/>
+            <w:color w:val="111827"/>
+            <w:u w:val="none"/>
+          </w:rPr>
+          <w:t xml:space="preserve">2.1 Product Spec	5</w:t>
+        </w:r>
+      </w:hyperlink>
     </w:p>
     <w:p>
       <w:pPr>
@@ -649,17 +669,19 @@
         <w:spacing w:after="160"/>
         <w:ind w:left="420"/>
       </w:pPr>
-      <w:r>
-        <w:rPr>
-          <w:rFonts w:ascii="宋体" w:hAnsi="宋体" w:eastAsia="宋体"/>
-          <w:b w:val="0"/>
-          <w:color w:val="111827"/>
-          <w:sz w:val="24"/>
-        </w:rPr>
-        <w:t>2.2 API Spec</w:t>
-        <w:tab/>
-        <w:t>7</w:t>
-      </w:r>
+      <w:hyperlink w:anchor="bm_h_5" w:history="1">
+        <w:r>
+          <w:rPr>
+            <w:rStyle w:val="Hyperlink"/>
+            <w:rFonts w:ascii="宋体" w:hAnsi="宋体" w:eastAsia="宋体"/>
+            <w:sz w:val="24"/>
+            <w:szCs w:val="24"/>
+            <w:color w:val="111827"/>
+            <w:u w:val="none"/>
+          </w:rPr>
+          <w:t xml:space="preserve">2.2 API Spec	7</w:t>
+        </w:r>
+      </w:hyperlink>
     </w:p>
     <w:p>
       <w:pPr>
@@ -669,17 +691,19 @@
         <w:spacing w:after="160"/>
         <w:ind w:left="420"/>
       </w:pPr>
-      <w:r>
-        <w:rPr>
-          <w:rFonts w:ascii="宋体" w:hAnsi="宋体" w:eastAsia="宋体"/>
-          <w:b w:val="0"/>
-          <w:color w:val="111827"/>
-          <w:sz w:val="24"/>
-        </w:rPr>
-        <w:t>2.3 SDD 核心</w:t>
-        <w:tab/>
-        <w:t>8</w:t>
-      </w:r>
+      <w:hyperlink w:anchor="bm_h_6" w:history="1">
+        <w:r>
+          <w:rPr>
+            <w:rStyle w:val="Hyperlink"/>
+            <w:rFonts w:ascii="宋体" w:hAnsi="宋体" w:eastAsia="宋体"/>
+            <w:sz w:val="24"/>
+            <w:szCs w:val="24"/>
+            <w:color w:val="111827"/>
+            <w:u w:val="none"/>
+          </w:rPr>
+          <w:t xml:space="preserve">2.3 SDD 核心	8</w:t>
+        </w:r>
+      </w:hyperlink>
     </w:p>
     <w:p>
       <w:pPr>
@@ -689,17 +713,21 @@
         <w:spacing w:after="160"/>
         <w:ind w:left="0"/>
       </w:pPr>
-      <w:r>
-        <w:rPr>
-          <w:rFonts w:ascii="宋体" w:hAnsi="宋体" w:eastAsia="宋体"/>
-          <w:b/>
-          <w:color w:val="111827"/>
-          <w:sz w:val="24"/>
-        </w:rPr>
-        <w:t>三、系统架构与设计</w:t>
-        <w:tab/>
-        <w:t>9</w:t>
-      </w:r>
+      <w:hyperlink w:anchor="bm_h_7" w:history="1">
+        <w:r>
+          <w:rPr>
+            <w:rStyle w:val="Hyperlink"/>
+            <w:rFonts w:ascii="宋体" w:hAnsi="宋体" w:eastAsia="宋体"/>
+            <w:sz w:val="24"/>
+            <w:szCs w:val="24"/>
+            <w:color w:val="111827"/>
+            <w:b/>
+            <w:bCs/>
+            <w:u w:val="none"/>
+          </w:rPr>
+          <w:t xml:space="preserve">三、系统架构与设计	9</w:t>
+        </w:r>
+      </w:hyperlink>
     </w:p>
     <w:p>
       <w:pPr>
@@ -709,17 +737,19 @@
         <w:spacing w:after="160"/>
         <w:ind w:left="420"/>
       </w:pPr>
-      <w:r>
-        <w:rPr>
-          <w:rFonts w:ascii="宋体" w:hAnsi="宋体" w:eastAsia="宋体"/>
-          <w:b w:val="0"/>
-          <w:color w:val="111827"/>
-          <w:sz w:val="24"/>
-        </w:rPr>
-        <w:t>3.1 总体架构</w:t>
-        <w:tab/>
-        <w:t>9</w:t>
-      </w:r>
+      <w:hyperlink w:anchor="bm_h_8" w:history="1">
+        <w:r>
+          <w:rPr>
+            <w:rStyle w:val="Hyperlink"/>
+            <w:rFonts w:ascii="宋体" w:hAnsi="宋体" w:eastAsia="宋体"/>
+            <w:sz w:val="24"/>
+            <w:szCs w:val="24"/>
+            <w:color w:val="111827"/>
+            <w:u w:val="none"/>
+          </w:rPr>
+          <w:t xml:space="preserve">3.1 总体架构	9</w:t>
+        </w:r>
+      </w:hyperlink>
     </w:p>
     <w:p>
       <w:pPr>
@@ -729,17 +759,19 @@
         <w:spacing w:after="160"/>
         <w:ind w:left="420"/>
       </w:pPr>
-      <w:r>
-        <w:rPr>
-          <w:rFonts w:ascii="宋体" w:hAnsi="宋体" w:eastAsia="宋体"/>
-          <w:b w:val="0"/>
-          <w:color w:val="111827"/>
-          <w:sz w:val="24"/>
-        </w:rPr>
-        <w:t>3.2 Agent 交互流程</w:t>
-        <w:tab/>
-        <w:t>10</w:t>
-      </w:r>
+      <w:hyperlink w:anchor="bm_h_9" w:history="1">
+        <w:r>
+          <w:rPr>
+            <w:rStyle w:val="Hyperlink"/>
+            <w:rFonts w:ascii="宋体" w:hAnsi="宋体" w:eastAsia="宋体"/>
+            <w:sz w:val="24"/>
+            <w:szCs w:val="24"/>
+            <w:color w:val="111827"/>
+            <w:u w:val="none"/>
+          </w:rPr>
+          <w:t xml:space="preserve">3.2 Agent 交互流程	10</w:t>
+        </w:r>
+      </w:hyperlink>
     </w:p>
     <w:p>
       <w:pPr>
@@ -749,17 +781,19 @@
         <w:spacing w:after="160"/>
         <w:ind w:left="420"/>
       </w:pPr>
-      <w:r>
-        <w:rPr>
-          <w:rFonts w:ascii="宋体" w:hAnsi="宋体" w:eastAsia="宋体"/>
-          <w:b w:val="0"/>
-          <w:color w:val="111827"/>
-          <w:sz w:val="24"/>
-        </w:rPr>
-        <w:t>3.3 数据设计</w:t>
-        <w:tab/>
-        <w:t>12</w:t>
-      </w:r>
+      <w:hyperlink w:anchor="bm_h_10" w:history="1">
+        <w:r>
+          <w:rPr>
+            <w:rStyle w:val="Hyperlink"/>
+            <w:rFonts w:ascii="宋体" w:hAnsi="宋体" w:eastAsia="宋体"/>
+            <w:sz w:val="24"/>
+            <w:szCs w:val="24"/>
+            <w:color w:val="111827"/>
+            <w:u w:val="none"/>
+          </w:rPr>
+          <w:t xml:space="preserve">3.3 数据设计	12</w:t>
+        </w:r>
+      </w:hyperlink>
     </w:p>
     <w:p>
       <w:pPr>
@@ -769,17 +803,21 @@
         <w:spacing w:after="160"/>
         <w:ind w:left="0"/>
       </w:pPr>
-      <w:r>
-        <w:rPr>
-          <w:rFonts w:ascii="宋体" w:hAnsi="宋体" w:eastAsia="宋体"/>
-          <w:b/>
-          <w:color w:val="111827"/>
-          <w:sz w:val="24"/>
-        </w:rPr>
-        <w:t>四、关键实现与代码展示</w:t>
-        <w:tab/>
-        <w:t>13</w:t>
-      </w:r>
+      <w:hyperlink w:anchor="bm_h_11" w:history="1">
+        <w:r>
+          <w:rPr>
+            <w:rStyle w:val="Hyperlink"/>
+            <w:rFonts w:ascii="宋体" w:hAnsi="宋体" w:eastAsia="宋体"/>
+            <w:sz w:val="24"/>
+            <w:szCs w:val="24"/>
+            <w:color w:val="111827"/>
+            <w:b/>
+            <w:bCs/>
+            <w:u w:val="none"/>
+          </w:rPr>
+          <w:t xml:space="preserve">四、关键实现与代码展示	13</w:t>
+        </w:r>
+      </w:hyperlink>
     </w:p>
     <w:p>
       <w:pPr>
@@ -789,17 +827,19 @@
         <w:spacing w:after="160"/>
         <w:ind w:left="420"/>
       </w:pPr>
-      <w:r>
-        <w:rPr>
-          <w:rFonts w:ascii="宋体" w:hAnsi="宋体" w:eastAsia="宋体"/>
-          <w:b w:val="0"/>
-          <w:color w:val="111827"/>
-          <w:sz w:val="24"/>
-        </w:rPr>
-        <w:t>4.1 LegalAgentService</w:t>
-        <w:tab/>
-        <w:t>13</w:t>
-      </w:r>
+      <w:hyperlink w:anchor="bm_h_12" w:history="1">
+        <w:r>
+          <w:rPr>
+            <w:rStyle w:val="Hyperlink"/>
+            <w:rFonts w:ascii="宋体" w:hAnsi="宋体" w:eastAsia="宋体"/>
+            <w:sz w:val="24"/>
+            <w:szCs w:val="24"/>
+            <w:color w:val="111827"/>
+            <w:u w:val="none"/>
+          </w:rPr>
+          <w:t xml:space="preserve">4.1 LegalAgentService	13</w:t>
+        </w:r>
+      </w:hyperlink>
     </w:p>
     <w:p>
       <w:pPr>
@@ -809,17 +849,19 @@
         <w:spacing w:after="160"/>
         <w:ind w:left="420"/>
       </w:pPr>
-      <w:r>
-        <w:rPr>
-          <w:rFonts w:ascii="宋体" w:hAnsi="宋体" w:eastAsia="宋体"/>
-          <w:b w:val="0"/>
-          <w:color w:val="111827"/>
-          <w:sz w:val="24"/>
-        </w:rPr>
-        <w:t>4.2 RAG 与知识库</w:t>
-        <w:tab/>
-        <w:t>14</w:t>
-      </w:r>
+      <w:hyperlink w:anchor="bm_h_13" w:history="1">
+        <w:r>
+          <w:rPr>
+            <w:rStyle w:val="Hyperlink"/>
+            <w:rFonts w:ascii="宋体" w:hAnsi="宋体" w:eastAsia="宋体"/>
+            <w:sz w:val="24"/>
+            <w:szCs w:val="24"/>
+            <w:color w:val="111827"/>
+            <w:u w:val="none"/>
+          </w:rPr>
+          <w:t xml:space="preserve">4.2 RAG 与知识库	14</w:t>
+        </w:r>
+      </w:hyperlink>
     </w:p>
     <w:p>
       <w:pPr>
@@ -829,17 +871,19 @@
         <w:spacing w:after="160"/>
         <w:ind w:left="420"/>
       </w:pPr>
-      <w:r>
-        <w:rPr>
-          <w:rFonts w:ascii="宋体" w:hAnsi="宋体" w:eastAsia="宋体"/>
-          <w:b w:val="0"/>
-          <w:color w:val="111827"/>
-          <w:sz w:val="24"/>
-        </w:rPr>
-        <w:t>4.3 前端交互</w:t>
-        <w:tab/>
-        <w:t>15</w:t>
-      </w:r>
+      <w:hyperlink w:anchor="bm_h_14" w:history="1">
+        <w:r>
+          <w:rPr>
+            <w:rStyle w:val="Hyperlink"/>
+            <w:rFonts w:ascii="宋体" w:hAnsi="宋体" w:eastAsia="宋体"/>
+            <w:sz w:val="24"/>
+            <w:szCs w:val="24"/>
+            <w:color w:val="111827"/>
+            <w:u w:val="none"/>
+          </w:rPr>
+          <w:t xml:space="preserve">4.3 前端交互	15</w:t>
+        </w:r>
+      </w:hyperlink>
     </w:p>
     <w:p>
       <w:pPr>
@@ -849,17 +893,19 @@
         <w:spacing w:after="160"/>
         <w:ind w:left="420"/>
       </w:pPr>
-      <w:r>
-        <w:rPr>
-          <w:rFonts w:ascii="宋体" w:hAnsi="宋体" w:eastAsia="宋体"/>
-          <w:b w:val="0"/>
-          <w:color w:val="111827"/>
-          <w:sz w:val="24"/>
-        </w:rPr>
-        <w:t>4.4 安全边界</w:t>
-        <w:tab/>
-        <w:t>16</w:t>
-      </w:r>
+      <w:hyperlink w:anchor="bm_h_15" w:history="1">
+        <w:r>
+          <w:rPr>
+            <w:rStyle w:val="Hyperlink"/>
+            <w:rFonts w:ascii="宋体" w:hAnsi="宋体" w:eastAsia="宋体"/>
+            <w:sz w:val="24"/>
+            <w:szCs w:val="24"/>
+            <w:color w:val="111827"/>
+            <w:u w:val="none"/>
+          </w:rPr>
+          <w:t xml:space="preserve">4.4 安全边界	16</w:t>
+        </w:r>
+      </w:hyperlink>
     </w:p>
     <w:p>
       <w:pPr>
@@ -869,17 +915,21 @@
         <w:spacing w:after="160"/>
         <w:ind w:left="0"/>
       </w:pPr>
-      <w:r>
-        <w:rPr>
-          <w:rFonts w:ascii="宋体" w:hAnsi="宋体" w:eastAsia="宋体"/>
-          <w:b/>
-          <w:color w:val="111827"/>
-          <w:sz w:val="24"/>
-        </w:rPr>
-        <w:t>五、测试与评估</w:t>
-        <w:tab/>
-        <w:t>17</w:t>
-      </w:r>
+      <w:hyperlink w:anchor="bm_h_16" w:history="1">
+        <w:r>
+          <w:rPr>
+            <w:rStyle w:val="Hyperlink"/>
+            <w:rFonts w:ascii="宋体" w:hAnsi="宋体" w:eastAsia="宋体"/>
+            <w:sz w:val="24"/>
+            <w:szCs w:val="24"/>
+            <w:color w:val="111827"/>
+            <w:b/>
+            <w:bCs/>
+            <w:u w:val="none"/>
+          </w:rPr>
+          <w:t xml:space="preserve">五、测试与评估	17</w:t>
+        </w:r>
+      </w:hyperlink>
     </w:p>
     <w:p>
       <w:pPr>
@@ -889,17 +939,19 @@
         <w:spacing w:after="160"/>
         <w:ind w:left="420"/>
       </w:pPr>
-      <w:r>
-        <w:rPr>
-          <w:rFonts w:ascii="宋体" w:hAnsi="宋体" w:eastAsia="宋体"/>
-          <w:b w:val="0"/>
-          <w:color w:val="111827"/>
-          <w:sz w:val="24"/>
-        </w:rPr>
-        <w:t>5.1 功能测试</w:t>
-        <w:tab/>
-        <w:t>17</w:t>
-      </w:r>
+      <w:hyperlink w:anchor="bm_h_17" w:history="1">
+        <w:r>
+          <w:rPr>
+            <w:rStyle w:val="Hyperlink"/>
+            <w:rFonts w:ascii="宋体" w:hAnsi="宋体" w:eastAsia="宋体"/>
+            <w:sz w:val="24"/>
+            <w:szCs w:val="24"/>
+            <w:color w:val="111827"/>
+            <w:u w:val="none"/>
+          </w:rPr>
+          <w:t xml:space="preserve">5.1 功能测试	17</w:t>
+        </w:r>
+      </w:hyperlink>
     </w:p>
     <w:p>
       <w:pPr>
@@ -909,17 +961,19 @@
         <w:spacing w:after="160"/>
         <w:ind w:left="420"/>
       </w:pPr>
-      <w:r>
-        <w:rPr>
-          <w:rFonts w:ascii="宋体" w:hAnsi="宋体" w:eastAsia="宋体"/>
-          <w:b w:val="0"/>
-          <w:color w:val="111827"/>
-          <w:sz w:val="24"/>
-        </w:rPr>
-        <w:t>5.2 构建测试</w:t>
-        <w:tab/>
-        <w:t>18</w:t>
-      </w:r>
+      <w:hyperlink w:anchor="bm_h_18" w:history="1">
+        <w:r>
+          <w:rPr>
+            <w:rStyle w:val="Hyperlink"/>
+            <w:rFonts w:ascii="宋体" w:hAnsi="宋体" w:eastAsia="宋体"/>
+            <w:sz w:val="24"/>
+            <w:szCs w:val="24"/>
+            <w:color w:val="111827"/>
+            <w:u w:val="none"/>
+          </w:rPr>
+          <w:t xml:space="preserve">5.2 构建测试	18</w:t>
+        </w:r>
+      </w:hyperlink>
     </w:p>
     <w:p>
       <w:r>
@@ -934,17 +988,19 @@
         <w:spacing w:after="160"/>
         <w:ind w:left="420"/>
       </w:pPr>
-      <w:r>
-        <w:rPr>
-          <w:rFonts w:ascii="宋体" w:hAnsi="宋体" w:eastAsia="宋体"/>
-          <w:b w:val="0"/>
-          <w:color w:val="111827"/>
-          <w:sz w:val="24"/>
-        </w:rPr>
-        <w:t>5.3 Demo 评估</w:t>
-        <w:tab/>
-        <w:t>18</w:t>
-      </w:r>
+      <w:hyperlink w:anchor="bm_h_19" w:history="1">
+        <w:r>
+          <w:rPr>
+            <w:rStyle w:val="Hyperlink"/>
+            <w:rFonts w:ascii="宋体" w:hAnsi="宋体" w:eastAsia="宋体"/>
+            <w:sz w:val="24"/>
+            <w:szCs w:val="24"/>
+            <w:color w:val="111827"/>
+            <w:u w:val="none"/>
+          </w:rPr>
+          <w:t xml:space="preserve">5.3 Demo 评估	18</w:t>
+        </w:r>
+      </w:hyperlink>
     </w:p>
     <w:p>
       <w:pPr>
@@ -954,17 +1010,21 @@
         <w:spacing w:after="160"/>
         <w:ind w:left="0"/>
       </w:pPr>
-      <w:r>
-        <w:rPr>
-          <w:rFonts w:ascii="宋体" w:hAnsi="宋体" w:eastAsia="宋体"/>
-          <w:b/>
-          <w:color w:val="111827"/>
-          <w:sz w:val="24"/>
-        </w:rPr>
-        <w:t>六、系统升级与扩展</w:t>
-        <w:tab/>
-        <w:t>19</w:t>
-      </w:r>
+      <w:hyperlink w:anchor="bm_h_20" w:history="1">
+        <w:r>
+          <w:rPr>
+            <w:rStyle w:val="Hyperlink"/>
+            <w:rFonts w:ascii="宋体" w:hAnsi="宋体" w:eastAsia="宋体"/>
+            <w:sz w:val="24"/>
+            <w:szCs w:val="24"/>
+            <w:color w:val="111827"/>
+            <w:b/>
+            <w:bCs/>
+            <w:u w:val="none"/>
+          </w:rPr>
+          <w:t xml:space="preserve">六、系统升级与扩展	19</w:t>
+        </w:r>
+      </w:hyperlink>
     </w:p>
     <w:p>
       <w:pPr>
@@ -974,17 +1034,21 @@
         <w:spacing w:after="160"/>
         <w:ind w:left="0"/>
       </w:pPr>
-      <w:r>
-        <w:rPr>
-          <w:rFonts w:ascii="宋体" w:hAnsi="宋体" w:eastAsia="宋体"/>
-          <w:b/>
-          <w:color w:val="111827"/>
-          <w:sz w:val="24"/>
-        </w:rPr>
-        <w:t>七、课程总结</w:t>
-        <w:tab/>
-        <w:t>20</w:t>
-      </w:r>
+      <w:hyperlink w:anchor="bm_h_21" w:history="1">
+        <w:r>
+          <w:rPr>
+            <w:rStyle w:val="Hyperlink"/>
+            <w:rFonts w:ascii="宋体" w:hAnsi="宋体" w:eastAsia="宋体"/>
+            <w:sz w:val="24"/>
+            <w:szCs w:val="24"/>
+            <w:color w:val="111827"/>
+            <w:b/>
+            <w:bCs/>
+            <w:u w:val="none"/>
+          </w:rPr>
+          <w:t xml:space="preserve">七、课程总结	20</w:t>
+        </w:r>
+      </w:hyperlink>
     </w:p>
     <w:p>
       <w:pPr>
@@ -994,17 +1058,21 @@
         <w:spacing w:after="160"/>
         <w:ind w:left="0"/>
       </w:pPr>
-      <w:r>
-        <w:rPr>
-          <w:rFonts w:ascii="宋体" w:hAnsi="宋体" w:eastAsia="宋体"/>
-          <w:b/>
-          <w:color w:val="111827"/>
-          <w:sz w:val="24"/>
-        </w:rPr>
-        <w:t>附录：运行方式</w:t>
-        <w:tab/>
-        <w:t>21</w:t>
-      </w:r>
+      <w:hyperlink w:anchor="bm_h_22" w:history="1">
+        <w:r>
+          <w:rPr>
+            <w:rStyle w:val="Hyperlink"/>
+            <w:rFonts w:ascii="宋体" w:hAnsi="宋体" w:eastAsia="宋体"/>
+            <w:sz w:val="24"/>
+            <w:szCs w:val="24"/>
+            <w:color w:val="111827"/>
+            <w:b/>
+            <w:bCs/>
+            <w:u w:val="none"/>
+          </w:rPr>
+          <w:t xml:space="preserve">附录：运行方式	21</w:t>
+        </w:r>
+      </w:hyperlink>
     </w:p>
     <w:p>
       <w:pPr>
@@ -1014,17 +1082,19 @@
         <w:spacing w:after="160"/>
         <w:ind w:left="420"/>
       </w:pPr>
-      <w:r>
-        <w:rPr>
-          <w:rFonts w:ascii="宋体" w:hAnsi="宋体" w:eastAsia="宋体"/>
-          <w:b w:val="0"/>
-          <w:color w:val="111827"/>
-          <w:sz w:val="24"/>
-        </w:rPr>
-        <w:t>附录 A：项目文件与交付物对照</w:t>
-        <w:tab/>
-        <w:t>21</w:t>
-      </w:r>
+      <w:hyperlink w:anchor="bm_h_23" w:history="1">
+        <w:r>
+          <w:rPr>
+            <w:rStyle w:val="Hyperlink"/>
+            <w:rFonts w:ascii="宋体" w:hAnsi="宋体" w:eastAsia="宋体"/>
+            <w:sz w:val="24"/>
+            <w:szCs w:val="24"/>
+            <w:color w:val="111827"/>
+            <w:u w:val="none"/>
+          </w:rPr>
+          <w:t xml:space="preserve">附录 A：项目文件与交付物对照	21</w:t>
+        </w:r>
+      </w:hyperlink>
     </w:p>
     <w:p>
       <w:pPr>
@@ -1034,17 +1104,19 @@
         <w:spacing w:after="160"/>
         <w:ind w:left="420"/>
       </w:pPr>
-      <w:r>
-        <w:rPr>
-          <w:rFonts w:ascii="宋体" w:hAnsi="宋体" w:eastAsia="宋体"/>
-          <w:b w:val="0"/>
-          <w:color w:val="111827"/>
-          <w:sz w:val="24"/>
-        </w:rPr>
-        <w:t>附录 B：关键术语说明</w:t>
-        <w:tab/>
-        <w:t>22</w:t>
-      </w:r>
+      <w:hyperlink w:anchor="bm_h_24" w:history="1">
+        <w:r>
+          <w:rPr>
+            <w:rStyle w:val="Hyperlink"/>
+            <w:rFonts w:ascii="宋体" w:hAnsi="宋体" w:eastAsia="宋体"/>
+            <w:sz w:val="24"/>
+            <w:szCs w:val="24"/>
+            <w:color w:val="111827"/>
+            <w:u w:val="none"/>
+          </w:rPr>
+          <w:t xml:space="preserve">附录 B：关键术语说明	22</w:t>
+        </w:r>
+      </w:hyperlink>
     </w:p>
     <w:p>
       <w:r>
@@ -1565,6 +1637,7 @@
       </w:pPr>
     </w:p>
     <w:p>
+      <w:bookmarkStart w:id="10" w:name="bm_h_1"/>
       <w:pPr>
         <w:pStyle w:val="Heading1"/>
         <w:spacing w:before="1000" w:after="440"/>
@@ -1579,6 +1652,7 @@
         </w:rPr>
         <w:t>摘要</w:t>
       </w:r>
+      <w:bookmarkEnd w:id="10"/>
     </w:p>
     <w:p>
       <w:pPr>
@@ -2303,6 +2377,7 @@
       </w:pPr>
     </w:p>
     <w:p>
+      <w:bookmarkStart w:id="11" w:name="bm_h_2"/>
       <w:pPr>
         <w:pStyle w:val="Heading1"/>
       </w:pPr>
@@ -2315,6 +2390,7 @@
         </w:rPr>
         <w:t>一、选题背景与设计思想</w:t>
       </w:r>
+      <w:bookmarkEnd w:id="11"/>
     </w:p>
     <w:p>
       <w:pPr>
@@ -2395,6 +2471,7 @@
       </w:r>
     </w:p>
     <w:p>
+      <w:bookmarkStart w:id="12" w:name="bm_h_3"/>
       <w:pPr>
         <w:pStyle w:val="Heading1"/>
       </w:pPr>
@@ -2407,8 +2484,10 @@
         </w:rPr>
         <w:t>二、Specs 规格设计</w:t>
       </w:r>
+      <w:bookmarkEnd w:id="12"/>
     </w:p>
     <w:p>
+      <w:bookmarkStart w:id="13" w:name="bm_h_4"/>
       <w:pPr>
         <w:pStyle w:val="Heading2"/>
       </w:pPr>
@@ -2421,6 +2500,7 @@
         </w:rPr>
         <w:t>2.1 Product Spec</w:t>
       </w:r>
+      <w:bookmarkEnd w:id="13"/>
     </w:p>
     <w:p>
       <w:pPr>
@@ -4441,6 +4521,7 @@
       </w:pPr>
     </w:p>
     <w:p>
+      <w:bookmarkStart w:id="14" w:name="bm_h_5"/>
       <w:pPr>
         <w:pStyle w:val="Heading2"/>
       </w:pPr>
@@ -4453,6 +4534,7 @@
         </w:rPr>
         <w:t>2.2 API Spec</w:t>
       </w:r>
+      <w:bookmarkEnd w:id="14"/>
     </w:p>
     <w:p>
       <w:pPr>
@@ -5236,6 +5318,7 @@
       </w:r>
     </w:p>
     <w:p>
+      <w:bookmarkStart w:id="15" w:name="bm_h_6"/>
       <w:pPr>
         <w:pStyle w:val="Heading2"/>
       </w:pPr>
@@ -5248,6 +5331,7 @@
         </w:rPr>
         <w:t>2.3 SDD 核心</w:t>
       </w:r>
+      <w:bookmarkEnd w:id="15"/>
     </w:p>
     <w:p>
       <w:pPr>
@@ -6467,6 +6551,7 @@
       </w:r>
     </w:p>
     <w:p>
+      <w:bookmarkStart w:id="16" w:name="bm_h_7"/>
       <w:pPr>
         <w:pStyle w:val="Heading1"/>
       </w:pPr>
@@ -6479,8 +6564,10 @@
         </w:rPr>
         <w:t>三、系统架构与设计</w:t>
       </w:r>
+      <w:bookmarkEnd w:id="16"/>
     </w:p>
     <w:p>
+      <w:bookmarkStart w:id="17" w:name="bm_h_8"/>
       <w:pPr>
         <w:pStyle w:val="Heading2"/>
       </w:pPr>
@@ -6493,6 +6580,7 @@
         </w:rPr>
         <w:t>3.1 总体架构</w:t>
       </w:r>
+      <w:bookmarkEnd w:id="17"/>
     </w:p>
     <w:p>
       <w:pPr>
@@ -6699,6 +6787,7 @@
       </w:r>
     </w:p>
     <w:p>
+      <w:bookmarkStart w:id="18" w:name="bm_h_9"/>
       <w:pPr>
         <w:pStyle w:val="Heading2"/>
       </w:pPr>
@@ -6711,6 +6800,7 @@
         </w:rPr>
         <w:t>3.2 Agent 交互流程</w:t>
       </w:r>
+      <w:bookmarkEnd w:id="18"/>
     </w:p>
     <w:p>
       <w:pPr>
@@ -6869,6 +6959,7 @@
       </w:r>
     </w:p>
     <w:p>
+      <w:bookmarkStart w:id="19" w:name="bm_h_10"/>
       <w:pPr>
         <w:pStyle w:val="Heading2"/>
       </w:pPr>
@@ -6881,6 +6972,7 @@
         </w:rPr>
         <w:t>3.3 数据设计</w:t>
       </w:r>
+      <w:bookmarkEnd w:id="19"/>
     </w:p>
     <w:p>
       <w:pPr>
@@ -7959,6 +8051,7 @@
       </w:r>
     </w:p>
     <w:p>
+      <w:bookmarkStart w:id="20" w:name="bm_h_11"/>
       <w:pPr>
         <w:pStyle w:val="Heading1"/>
       </w:pPr>
@@ -7971,8 +8064,10 @@
         </w:rPr>
         <w:t>四、关键实现与代码展示</w:t>
       </w:r>
+      <w:bookmarkEnd w:id="20"/>
     </w:p>
     <w:p>
+      <w:bookmarkStart w:id="21" w:name="bm_h_12"/>
       <w:pPr>
         <w:pStyle w:val="Heading2"/>
       </w:pPr>
@@ -7985,6 +8080,7 @@
         </w:rPr>
         <w:t>4.1 LegalAgentService</w:t>
       </w:r>
+      <w:bookmarkEnd w:id="21"/>
     </w:p>
     <w:p>
       <w:pPr>
@@ -9325,6 +9421,7 @@
       </w:r>
     </w:p>
     <w:p>
+      <w:bookmarkStart w:id="22" w:name="bm_h_13"/>
       <w:pPr>
         <w:pStyle w:val="Heading2"/>
       </w:pPr>
@@ -9337,6 +9434,7 @@
         </w:rPr>
         <w:t>4.2 RAG 与知识库</w:t>
       </w:r>
+      <w:bookmarkEnd w:id="22"/>
     </w:p>
     <w:p>
       <w:pPr>
@@ -9485,6 +9583,7 @@
       </w:r>
     </w:p>
     <w:p>
+      <w:bookmarkStart w:id="23" w:name="bm_h_14"/>
       <w:pPr>
         <w:pStyle w:val="Heading2"/>
       </w:pPr>
@@ -9497,6 +9596,7 @@
         </w:rPr>
         <w:t>4.3 前端交互</w:t>
       </w:r>
+      <w:bookmarkEnd w:id="23"/>
     </w:p>
     <w:p>
       <w:pPr>
@@ -9670,6 +9770,7 @@
       </w:r>
     </w:p>
     <w:p>
+      <w:bookmarkStart w:id="24" w:name="bm_h_15"/>
       <w:pPr>
         <w:pStyle w:val="Heading2"/>
       </w:pPr>
@@ -9682,6 +9783,7 @@
         </w:rPr>
         <w:t>4.4 安全边界</w:t>
       </w:r>
+      <w:bookmarkEnd w:id="24"/>
     </w:p>
     <w:p>
       <w:pPr>
@@ -10352,6 +10454,7 @@
       </w:r>
     </w:p>
     <w:p>
+      <w:bookmarkStart w:id="25" w:name="bm_h_16"/>
       <w:pPr>
         <w:pStyle w:val="Heading1"/>
       </w:pPr>
@@ -10364,8 +10467,10 @@
         </w:rPr>
         <w:t>五、测试与评估</w:t>
       </w:r>
+      <w:bookmarkEnd w:id="25"/>
     </w:p>
     <w:p>
+      <w:bookmarkStart w:id="26" w:name="bm_h_17"/>
       <w:pPr>
         <w:pStyle w:val="Heading2"/>
       </w:pPr>
@@ -10378,6 +10483,7 @@
         </w:rPr>
         <w:t>5.1 功能测试</w:t>
       </w:r>
+      <w:bookmarkEnd w:id="26"/>
     </w:p>
     <w:p>
       <w:pPr>
@@ -11248,6 +11354,7 @@
       </w:r>
     </w:p>
     <w:p>
+      <w:bookmarkStart w:id="27" w:name="bm_h_18"/>
       <w:pPr>
         <w:pStyle w:val="Heading2"/>
       </w:pPr>
@@ -11260,6 +11367,7 @@
         </w:rPr>
         <w:t>5.2 构建测试</w:t>
       </w:r>
+      <w:bookmarkEnd w:id="27"/>
     </w:p>
     <w:p>
       <w:pPr>
@@ -12037,6 +12145,7 @@
       </w:r>
     </w:p>
     <w:p>
+      <w:bookmarkStart w:id="28" w:name="bm_h_19"/>
       <w:pPr>
         <w:pStyle w:val="Heading2"/>
       </w:pPr>
@@ -12049,6 +12158,7 @@
         </w:rPr>
         <w:t>5.3 Demo 评估</w:t>
       </w:r>
+      <w:bookmarkEnd w:id="28"/>
     </w:p>
     <w:p>
       <w:pPr>
@@ -12732,6 +12842,7 @@
       </w:r>
     </w:p>
     <w:p>
+      <w:bookmarkStart w:id="29" w:name="bm_h_20"/>
       <w:pPr>
         <w:pStyle w:val="Heading1"/>
       </w:pPr>
@@ -12744,6 +12855,7 @@
         </w:rPr>
         <w:t>六、系统升级与扩展</w:t>
       </w:r>
+      <w:bookmarkEnd w:id="29"/>
     </w:p>
     <w:p>
       <w:pPr>
@@ -13559,6 +13671,7 @@
       </w:r>
     </w:p>
     <w:p>
+      <w:bookmarkStart w:id="30" w:name="bm_h_21"/>
       <w:pPr>
         <w:pStyle w:val="Heading1"/>
       </w:pPr>
@@ -13571,6 +13684,7 @@
         </w:rPr>
         <w:t>七、课程总结</w:t>
       </w:r>
+      <w:bookmarkEnd w:id="30"/>
     </w:p>
     <w:p>
       <w:pPr>
@@ -13679,6 +13793,7 @@
       </w:r>
     </w:p>
     <w:p>
+      <w:bookmarkStart w:id="31" w:name="bm_h_22"/>
       <w:pPr>
         <w:pStyle w:val="Heading1"/>
       </w:pPr>
@@ -13691,8 +13806,10 @@
         </w:rPr>
         <w:t>附录：运行方式</w:t>
       </w:r>
+      <w:bookmarkEnd w:id="31"/>
     </w:p>
     <w:p>
+      <w:bookmarkStart w:id="32" w:name="bm_h_23"/>
       <w:pPr>
         <w:pStyle w:val="Heading2"/>
       </w:pPr>
@@ -13705,6 +13822,7 @@
         </w:rPr>
         <w:t>附录 A：项目文件与交付物对照</w:t>
       </w:r>
+      <w:bookmarkEnd w:id="32"/>
     </w:p>
     <w:tbl>
       <w:tblPr>
@@ -14623,6 +14741,7 @@
       </w:pPr>
     </w:p>
     <w:p>
+      <w:bookmarkStart w:id="33" w:name="bm_h_24"/>
       <w:pPr>
         <w:pStyle w:val="Heading2"/>
       </w:pPr>
@@ -14635,6 +14754,7 @@
         </w:rPr>
         <w:t>附录 B：关键术语说明</w:t>
       </w:r>
+      <w:bookmarkEnd w:id="33"/>
     </w:p>
     <w:tbl>
       <w:tblPr>

</xml_diff>

<commit_message>
Tidy Word report catalog layout
</commit_message>
<xml_diff>
--- a/docs/CS599_大作业报告.docx
+++ b/docs/CS599_大作业报告.docx
@@ -546,34 +546,10 @@
     <w:p>
       <w:pPr>
         <w:tabs>
-          <w:tab w:pos="8731" w:val="right" w:leader="dot"/>
+          <w:tab w:pos="8391" w:val="right" w:leader="dot"/>
         </w:tabs>
-        <w:spacing w:after="160"/>
-        <w:ind w:left="0"/>
-      </w:pPr>
-      <w:hyperlink w:anchor="toc" w:history="1">
-        <w:r>
-          <w:rPr>
-            <w:rStyle w:val="Hyperlink"/>
-            <w:rFonts w:ascii="宋体" w:hAnsi="宋体" w:eastAsia="宋体"/>
-            <w:sz w:val="24"/>
-            <w:szCs w:val="24"/>
-            <w:color w:val="111827"/>
-            <w:b/>
-            <w:bCs/>
-            <w:u w:val="none"/>
-          </w:rPr>
-          <w:t xml:space="preserve">目录	2</w:t>
-        </w:r>
-      </w:hyperlink>
-    </w:p>
-    <w:p>
-      <w:pPr>
-        <w:tabs>
-          <w:tab w:pos="8731" w:val="right" w:leader="dot"/>
-        </w:tabs>
-        <w:spacing w:after="160"/>
-        <w:ind w:left="0"/>
+        <w:spacing w:line="240" w:lineRule="auto" w:before="80" w:after="120"/>
+        <w:ind w:left="0" w:right="85"/>
       </w:pPr>
       <w:hyperlink w:anchor="bm_h_1" w:history="1">
         <w:r>
@@ -587,17 +563,35 @@
             <w:bCs/>
             <w:u w:val="none"/>
           </w:rPr>
-          <w:t xml:space="preserve">摘要	3</w:t>
+          <w:t xml:space="preserve">摘要</w:t>
+        </w:r>
+      </w:hyperlink>
+      <w:r>
+        <w:tab/>
+      </w:r>
+      <w:hyperlink w:anchor="bm_h_1" w:history="1">
+        <w:r>
+          <w:rPr>
+            <w:rStyle w:val="Hyperlink"/>
+            <w:rFonts w:ascii="宋体" w:hAnsi="宋体" w:eastAsia="宋体"/>
+            <w:sz w:val="24"/>
+            <w:szCs w:val="24"/>
+            <w:color w:val="111827"/>
+            <w:b/>
+            <w:bCs/>
+            <w:u w:val="none"/>
+          </w:rPr>
+          <w:t xml:space="preserve">3</w:t>
         </w:r>
       </w:hyperlink>
     </w:p>
     <w:p>
       <w:pPr>
         <w:tabs>
-          <w:tab w:pos="8731" w:val="right" w:leader="dot"/>
+          <w:tab w:pos="8391" w:val="right" w:leader="dot"/>
         </w:tabs>
-        <w:spacing w:after="160"/>
-        <w:ind w:left="0"/>
+        <w:spacing w:line="240" w:lineRule="auto" w:before="80" w:after="120"/>
+        <w:ind w:left="0" w:right="85"/>
       </w:pPr>
       <w:hyperlink w:anchor="bm_h_2" w:history="1">
         <w:r>
@@ -611,17 +605,35 @@
             <w:bCs/>
             <w:u w:val="none"/>
           </w:rPr>
-          <w:t xml:space="preserve">一、选题背景与设计思想	4</w:t>
+          <w:t xml:space="preserve">一、选题背景与设计思想</w:t>
+        </w:r>
+      </w:hyperlink>
+      <w:r>
+        <w:tab/>
+      </w:r>
+      <w:hyperlink w:anchor="bm_h_2" w:history="1">
+        <w:r>
+          <w:rPr>
+            <w:rStyle w:val="Hyperlink"/>
+            <w:rFonts w:ascii="宋体" w:hAnsi="宋体" w:eastAsia="宋体"/>
+            <w:sz w:val="24"/>
+            <w:szCs w:val="24"/>
+            <w:color w:val="111827"/>
+            <w:b/>
+            <w:bCs/>
+            <w:u w:val="none"/>
+          </w:rPr>
+          <w:t xml:space="preserve">4</w:t>
         </w:r>
       </w:hyperlink>
     </w:p>
     <w:p>
       <w:pPr>
         <w:tabs>
-          <w:tab w:pos="8731" w:val="right" w:leader="dot"/>
+          <w:tab w:pos="8391" w:val="right" w:leader="dot"/>
         </w:tabs>
-        <w:spacing w:after="160"/>
-        <w:ind w:left="0"/>
+        <w:spacing w:line="240" w:lineRule="auto" w:before="80" w:after="120"/>
+        <w:ind w:left="0" w:right="85"/>
       </w:pPr>
       <w:hyperlink w:anchor="bm_h_3" w:history="1">
         <w:r>
@@ -635,17 +647,35 @@
             <w:bCs/>
             <w:u w:val="none"/>
           </w:rPr>
-          <w:t xml:space="preserve">二、Specs 规格设计	5</w:t>
+          <w:t xml:space="preserve">二、Specs 规格设计</w:t>
+        </w:r>
+      </w:hyperlink>
+      <w:r>
+        <w:tab/>
+      </w:r>
+      <w:hyperlink w:anchor="bm_h_3" w:history="1">
+        <w:r>
+          <w:rPr>
+            <w:rStyle w:val="Hyperlink"/>
+            <w:rFonts w:ascii="宋体" w:hAnsi="宋体" w:eastAsia="宋体"/>
+            <w:sz w:val="24"/>
+            <w:szCs w:val="24"/>
+            <w:color w:val="111827"/>
+            <w:b/>
+            <w:bCs/>
+            <w:u w:val="none"/>
+          </w:rPr>
+          <w:t xml:space="preserve">5</w:t>
         </w:r>
       </w:hyperlink>
     </w:p>
     <w:p>
       <w:pPr>
         <w:tabs>
-          <w:tab w:pos="8731" w:val="right" w:leader="dot"/>
+          <w:tab w:pos="8391" w:val="right" w:leader="dot"/>
         </w:tabs>
-        <w:spacing w:after="160"/>
-        <w:ind w:left="420"/>
+        <w:spacing w:line="240" w:lineRule="auto" w:before="40" w:after="80"/>
+        <w:ind w:left="408" w:right="85"/>
       </w:pPr>
       <w:hyperlink w:anchor="bm_h_4" w:history="1">
         <w:r>
@@ -657,17 +687,33 @@
             <w:color w:val="111827"/>
             <w:u w:val="none"/>
           </w:rPr>
-          <w:t xml:space="preserve">2.1 Product Spec	5</w:t>
+          <w:t xml:space="preserve">2.1 Product Spec</w:t>
+        </w:r>
+      </w:hyperlink>
+      <w:r>
+        <w:tab/>
+      </w:r>
+      <w:hyperlink w:anchor="bm_h_4" w:history="1">
+        <w:r>
+          <w:rPr>
+            <w:rStyle w:val="Hyperlink"/>
+            <w:rFonts w:ascii="宋体" w:hAnsi="宋体" w:eastAsia="宋体"/>
+            <w:sz w:val="24"/>
+            <w:szCs w:val="24"/>
+            <w:color w:val="111827"/>
+            <w:u w:val="none"/>
+          </w:rPr>
+          <w:t xml:space="preserve">5</w:t>
         </w:r>
       </w:hyperlink>
     </w:p>
     <w:p>
       <w:pPr>
         <w:tabs>
-          <w:tab w:pos="8731" w:val="right" w:leader="dot"/>
+          <w:tab w:pos="8391" w:val="right" w:leader="dot"/>
         </w:tabs>
-        <w:spacing w:after="160"/>
-        <w:ind w:left="420"/>
+        <w:spacing w:line="240" w:lineRule="auto" w:before="40" w:after="80"/>
+        <w:ind w:left="408" w:right="85"/>
       </w:pPr>
       <w:hyperlink w:anchor="bm_h_5" w:history="1">
         <w:r>
@@ -679,17 +725,33 @@
             <w:color w:val="111827"/>
             <w:u w:val="none"/>
           </w:rPr>
-          <w:t xml:space="preserve">2.2 API Spec	7</w:t>
+          <w:t xml:space="preserve">2.2 API Spec</w:t>
+        </w:r>
+      </w:hyperlink>
+      <w:r>
+        <w:tab/>
+      </w:r>
+      <w:hyperlink w:anchor="bm_h_5" w:history="1">
+        <w:r>
+          <w:rPr>
+            <w:rStyle w:val="Hyperlink"/>
+            <w:rFonts w:ascii="宋体" w:hAnsi="宋体" w:eastAsia="宋体"/>
+            <w:sz w:val="24"/>
+            <w:szCs w:val="24"/>
+            <w:color w:val="111827"/>
+            <w:u w:val="none"/>
+          </w:rPr>
+          <w:t xml:space="preserve">7</w:t>
         </w:r>
       </w:hyperlink>
     </w:p>
     <w:p>
       <w:pPr>
         <w:tabs>
-          <w:tab w:pos="8731" w:val="right" w:leader="dot"/>
+          <w:tab w:pos="8391" w:val="right" w:leader="dot"/>
         </w:tabs>
-        <w:spacing w:after="160"/>
-        <w:ind w:left="420"/>
+        <w:spacing w:line="240" w:lineRule="auto" w:before="40" w:after="80"/>
+        <w:ind w:left="408" w:right="85"/>
       </w:pPr>
       <w:hyperlink w:anchor="bm_h_6" w:history="1">
         <w:r>
@@ -701,17 +763,33 @@
             <w:color w:val="111827"/>
             <w:u w:val="none"/>
           </w:rPr>
-          <w:t xml:space="preserve">2.3 SDD 核心	8</w:t>
+          <w:t xml:space="preserve">2.3 SDD 核心</w:t>
+        </w:r>
+      </w:hyperlink>
+      <w:r>
+        <w:tab/>
+      </w:r>
+      <w:hyperlink w:anchor="bm_h_6" w:history="1">
+        <w:r>
+          <w:rPr>
+            <w:rStyle w:val="Hyperlink"/>
+            <w:rFonts w:ascii="宋体" w:hAnsi="宋体" w:eastAsia="宋体"/>
+            <w:sz w:val="24"/>
+            <w:szCs w:val="24"/>
+            <w:color w:val="111827"/>
+            <w:u w:val="none"/>
+          </w:rPr>
+          <w:t xml:space="preserve">8</w:t>
         </w:r>
       </w:hyperlink>
     </w:p>
     <w:p>
       <w:pPr>
         <w:tabs>
-          <w:tab w:pos="8731" w:val="right" w:leader="dot"/>
+          <w:tab w:pos="8391" w:val="right" w:leader="dot"/>
         </w:tabs>
-        <w:spacing w:after="160"/>
-        <w:ind w:left="0"/>
+        <w:spacing w:line="240" w:lineRule="auto" w:before="80" w:after="120"/>
+        <w:ind w:left="0" w:right="85"/>
       </w:pPr>
       <w:hyperlink w:anchor="bm_h_7" w:history="1">
         <w:r>
@@ -725,17 +803,35 @@
             <w:bCs/>
             <w:u w:val="none"/>
           </w:rPr>
-          <w:t xml:space="preserve">三、系统架构与设计	9</w:t>
+          <w:t xml:space="preserve">三、系统架构与设计</w:t>
+        </w:r>
+      </w:hyperlink>
+      <w:r>
+        <w:tab/>
+      </w:r>
+      <w:hyperlink w:anchor="bm_h_7" w:history="1">
+        <w:r>
+          <w:rPr>
+            <w:rStyle w:val="Hyperlink"/>
+            <w:rFonts w:ascii="宋体" w:hAnsi="宋体" w:eastAsia="宋体"/>
+            <w:sz w:val="24"/>
+            <w:szCs w:val="24"/>
+            <w:color w:val="111827"/>
+            <w:b/>
+            <w:bCs/>
+            <w:u w:val="none"/>
+          </w:rPr>
+          <w:t xml:space="preserve">9</w:t>
         </w:r>
       </w:hyperlink>
     </w:p>
     <w:p>
       <w:pPr>
         <w:tabs>
-          <w:tab w:pos="8731" w:val="right" w:leader="dot"/>
+          <w:tab w:pos="8391" w:val="right" w:leader="dot"/>
         </w:tabs>
-        <w:spacing w:after="160"/>
-        <w:ind w:left="420"/>
+        <w:spacing w:line="240" w:lineRule="auto" w:before="40" w:after="80"/>
+        <w:ind w:left="408" w:right="85"/>
       </w:pPr>
       <w:hyperlink w:anchor="bm_h_8" w:history="1">
         <w:r>
@@ -747,17 +843,33 @@
             <w:color w:val="111827"/>
             <w:u w:val="none"/>
           </w:rPr>
-          <w:t xml:space="preserve">3.1 总体架构	9</w:t>
+          <w:t xml:space="preserve">3.1 总体架构</w:t>
+        </w:r>
+      </w:hyperlink>
+      <w:r>
+        <w:tab/>
+      </w:r>
+      <w:hyperlink w:anchor="bm_h_8" w:history="1">
+        <w:r>
+          <w:rPr>
+            <w:rStyle w:val="Hyperlink"/>
+            <w:rFonts w:ascii="宋体" w:hAnsi="宋体" w:eastAsia="宋体"/>
+            <w:sz w:val="24"/>
+            <w:szCs w:val="24"/>
+            <w:color w:val="111827"/>
+            <w:u w:val="none"/>
+          </w:rPr>
+          <w:t xml:space="preserve">9</w:t>
         </w:r>
       </w:hyperlink>
     </w:p>
     <w:p>
       <w:pPr>
         <w:tabs>
-          <w:tab w:pos="8731" w:val="right" w:leader="dot"/>
+          <w:tab w:pos="8391" w:val="right" w:leader="dot"/>
         </w:tabs>
-        <w:spacing w:after="160"/>
-        <w:ind w:left="420"/>
+        <w:spacing w:line="240" w:lineRule="auto" w:before="40" w:after="80"/>
+        <w:ind w:left="408" w:right="85"/>
       </w:pPr>
       <w:hyperlink w:anchor="bm_h_9" w:history="1">
         <w:r>
@@ -769,17 +881,33 @@
             <w:color w:val="111827"/>
             <w:u w:val="none"/>
           </w:rPr>
-          <w:t xml:space="preserve">3.2 Agent 交互流程	10</w:t>
+          <w:t xml:space="preserve">3.2 Agent 交互流程</w:t>
+        </w:r>
+      </w:hyperlink>
+      <w:r>
+        <w:tab/>
+      </w:r>
+      <w:hyperlink w:anchor="bm_h_9" w:history="1">
+        <w:r>
+          <w:rPr>
+            <w:rStyle w:val="Hyperlink"/>
+            <w:rFonts w:ascii="宋体" w:hAnsi="宋体" w:eastAsia="宋体"/>
+            <w:sz w:val="24"/>
+            <w:szCs w:val="24"/>
+            <w:color w:val="111827"/>
+            <w:u w:val="none"/>
+          </w:rPr>
+          <w:t xml:space="preserve">10</w:t>
         </w:r>
       </w:hyperlink>
     </w:p>
     <w:p>
       <w:pPr>
         <w:tabs>
-          <w:tab w:pos="8731" w:val="right" w:leader="dot"/>
+          <w:tab w:pos="8391" w:val="right" w:leader="dot"/>
         </w:tabs>
-        <w:spacing w:after="160"/>
-        <w:ind w:left="420"/>
+        <w:spacing w:line="240" w:lineRule="auto" w:before="40" w:after="80"/>
+        <w:ind w:left="408" w:right="85"/>
       </w:pPr>
       <w:hyperlink w:anchor="bm_h_10" w:history="1">
         <w:r>
@@ -791,17 +919,33 @@
             <w:color w:val="111827"/>
             <w:u w:val="none"/>
           </w:rPr>
-          <w:t xml:space="preserve">3.3 数据设计	12</w:t>
+          <w:t xml:space="preserve">3.3 数据设计</w:t>
+        </w:r>
+      </w:hyperlink>
+      <w:r>
+        <w:tab/>
+      </w:r>
+      <w:hyperlink w:anchor="bm_h_10" w:history="1">
+        <w:r>
+          <w:rPr>
+            <w:rStyle w:val="Hyperlink"/>
+            <w:rFonts w:ascii="宋体" w:hAnsi="宋体" w:eastAsia="宋体"/>
+            <w:sz w:val="24"/>
+            <w:szCs w:val="24"/>
+            <w:color w:val="111827"/>
+            <w:u w:val="none"/>
+          </w:rPr>
+          <w:t xml:space="preserve">12</w:t>
         </w:r>
       </w:hyperlink>
     </w:p>
     <w:p>
       <w:pPr>
         <w:tabs>
-          <w:tab w:pos="8731" w:val="right" w:leader="dot"/>
+          <w:tab w:pos="8391" w:val="right" w:leader="dot"/>
         </w:tabs>
-        <w:spacing w:after="160"/>
-        <w:ind w:left="0"/>
+        <w:spacing w:line="240" w:lineRule="auto" w:before="80" w:after="120"/>
+        <w:ind w:left="0" w:right="85"/>
       </w:pPr>
       <w:hyperlink w:anchor="bm_h_11" w:history="1">
         <w:r>
@@ -815,17 +959,35 @@
             <w:bCs/>
             <w:u w:val="none"/>
           </w:rPr>
-          <w:t xml:space="preserve">四、关键实现与代码展示	13</w:t>
+          <w:t xml:space="preserve">四、关键实现与代码展示</w:t>
+        </w:r>
+      </w:hyperlink>
+      <w:r>
+        <w:tab/>
+      </w:r>
+      <w:hyperlink w:anchor="bm_h_11" w:history="1">
+        <w:r>
+          <w:rPr>
+            <w:rStyle w:val="Hyperlink"/>
+            <w:rFonts w:ascii="宋体" w:hAnsi="宋体" w:eastAsia="宋体"/>
+            <w:sz w:val="24"/>
+            <w:szCs w:val="24"/>
+            <w:color w:val="111827"/>
+            <w:b/>
+            <w:bCs/>
+            <w:u w:val="none"/>
+          </w:rPr>
+          <w:t xml:space="preserve">13</w:t>
         </w:r>
       </w:hyperlink>
     </w:p>
     <w:p>
       <w:pPr>
         <w:tabs>
-          <w:tab w:pos="8731" w:val="right" w:leader="dot"/>
+          <w:tab w:pos="8391" w:val="right" w:leader="dot"/>
         </w:tabs>
-        <w:spacing w:after="160"/>
-        <w:ind w:left="420"/>
+        <w:spacing w:line="240" w:lineRule="auto" w:before="40" w:after="80"/>
+        <w:ind w:left="408" w:right="85"/>
       </w:pPr>
       <w:hyperlink w:anchor="bm_h_12" w:history="1">
         <w:r>
@@ -837,17 +999,33 @@
             <w:color w:val="111827"/>
             <w:u w:val="none"/>
           </w:rPr>
-          <w:t xml:space="preserve">4.1 LegalAgentService	13</w:t>
+          <w:t xml:space="preserve">4.1 LegalAgentService</w:t>
+        </w:r>
+      </w:hyperlink>
+      <w:r>
+        <w:tab/>
+      </w:r>
+      <w:hyperlink w:anchor="bm_h_12" w:history="1">
+        <w:r>
+          <w:rPr>
+            <w:rStyle w:val="Hyperlink"/>
+            <w:rFonts w:ascii="宋体" w:hAnsi="宋体" w:eastAsia="宋体"/>
+            <w:sz w:val="24"/>
+            <w:szCs w:val="24"/>
+            <w:color w:val="111827"/>
+            <w:u w:val="none"/>
+          </w:rPr>
+          <w:t xml:space="preserve">13</w:t>
         </w:r>
       </w:hyperlink>
     </w:p>
     <w:p>
       <w:pPr>
         <w:tabs>
-          <w:tab w:pos="8731" w:val="right" w:leader="dot"/>
+          <w:tab w:pos="8391" w:val="right" w:leader="dot"/>
         </w:tabs>
-        <w:spacing w:after="160"/>
-        <w:ind w:left="420"/>
+        <w:spacing w:line="240" w:lineRule="auto" w:before="40" w:after="80"/>
+        <w:ind w:left="408" w:right="85"/>
       </w:pPr>
       <w:hyperlink w:anchor="bm_h_13" w:history="1">
         <w:r>
@@ -859,17 +1037,33 @@
             <w:color w:val="111827"/>
             <w:u w:val="none"/>
           </w:rPr>
-          <w:t xml:space="preserve">4.2 RAG 与知识库	14</w:t>
+          <w:t xml:space="preserve">4.2 RAG 与知识库</w:t>
+        </w:r>
+      </w:hyperlink>
+      <w:r>
+        <w:tab/>
+      </w:r>
+      <w:hyperlink w:anchor="bm_h_13" w:history="1">
+        <w:r>
+          <w:rPr>
+            <w:rStyle w:val="Hyperlink"/>
+            <w:rFonts w:ascii="宋体" w:hAnsi="宋体" w:eastAsia="宋体"/>
+            <w:sz w:val="24"/>
+            <w:szCs w:val="24"/>
+            <w:color w:val="111827"/>
+            <w:u w:val="none"/>
+          </w:rPr>
+          <w:t xml:space="preserve">14</w:t>
         </w:r>
       </w:hyperlink>
     </w:p>
     <w:p>
       <w:pPr>
         <w:tabs>
-          <w:tab w:pos="8731" w:val="right" w:leader="dot"/>
+          <w:tab w:pos="8391" w:val="right" w:leader="dot"/>
         </w:tabs>
-        <w:spacing w:after="160"/>
-        <w:ind w:left="420"/>
+        <w:spacing w:line="240" w:lineRule="auto" w:before="40" w:after="80"/>
+        <w:ind w:left="408" w:right="85"/>
       </w:pPr>
       <w:hyperlink w:anchor="bm_h_14" w:history="1">
         <w:r>
@@ -881,17 +1075,33 @@
             <w:color w:val="111827"/>
             <w:u w:val="none"/>
           </w:rPr>
-          <w:t xml:space="preserve">4.3 前端交互	15</w:t>
+          <w:t xml:space="preserve">4.3 前端交互</w:t>
+        </w:r>
+      </w:hyperlink>
+      <w:r>
+        <w:tab/>
+      </w:r>
+      <w:hyperlink w:anchor="bm_h_14" w:history="1">
+        <w:r>
+          <w:rPr>
+            <w:rStyle w:val="Hyperlink"/>
+            <w:rFonts w:ascii="宋体" w:hAnsi="宋体" w:eastAsia="宋体"/>
+            <w:sz w:val="24"/>
+            <w:szCs w:val="24"/>
+            <w:color w:val="111827"/>
+            <w:u w:val="none"/>
+          </w:rPr>
+          <w:t xml:space="preserve">15</w:t>
         </w:r>
       </w:hyperlink>
     </w:p>
     <w:p>
       <w:pPr>
         <w:tabs>
-          <w:tab w:pos="8731" w:val="right" w:leader="dot"/>
+          <w:tab w:pos="8391" w:val="right" w:leader="dot"/>
         </w:tabs>
-        <w:spacing w:after="160"/>
-        <w:ind w:left="420"/>
+        <w:spacing w:line="240" w:lineRule="auto" w:before="40" w:after="80"/>
+        <w:ind w:left="408" w:right="85"/>
       </w:pPr>
       <w:hyperlink w:anchor="bm_h_15" w:history="1">
         <w:r>
@@ -903,17 +1113,33 @@
             <w:color w:val="111827"/>
             <w:u w:val="none"/>
           </w:rPr>
-          <w:t xml:space="preserve">4.4 安全边界	16</w:t>
+          <w:t xml:space="preserve">4.4 安全边界</w:t>
+        </w:r>
+      </w:hyperlink>
+      <w:r>
+        <w:tab/>
+      </w:r>
+      <w:hyperlink w:anchor="bm_h_15" w:history="1">
+        <w:r>
+          <w:rPr>
+            <w:rStyle w:val="Hyperlink"/>
+            <w:rFonts w:ascii="宋体" w:hAnsi="宋体" w:eastAsia="宋体"/>
+            <w:sz w:val="24"/>
+            <w:szCs w:val="24"/>
+            <w:color w:val="111827"/>
+            <w:u w:val="none"/>
+          </w:rPr>
+          <w:t xml:space="preserve">16</w:t>
         </w:r>
       </w:hyperlink>
     </w:p>
     <w:p>
       <w:pPr>
         <w:tabs>
-          <w:tab w:pos="8731" w:val="right" w:leader="dot"/>
+          <w:tab w:pos="8391" w:val="right" w:leader="dot"/>
         </w:tabs>
-        <w:spacing w:after="160"/>
-        <w:ind w:left="0"/>
+        <w:spacing w:line="240" w:lineRule="auto" w:before="80" w:after="120"/>
+        <w:ind w:left="0" w:right="85"/>
       </w:pPr>
       <w:hyperlink w:anchor="bm_h_16" w:history="1">
         <w:r>
@@ -927,17 +1153,35 @@
             <w:bCs/>
             <w:u w:val="none"/>
           </w:rPr>
-          <w:t xml:space="preserve">五、测试与评估	17</w:t>
+          <w:t xml:space="preserve">五、测试与评估</w:t>
+        </w:r>
+      </w:hyperlink>
+      <w:r>
+        <w:tab/>
+      </w:r>
+      <w:hyperlink w:anchor="bm_h_16" w:history="1">
+        <w:r>
+          <w:rPr>
+            <w:rStyle w:val="Hyperlink"/>
+            <w:rFonts w:ascii="宋体" w:hAnsi="宋体" w:eastAsia="宋体"/>
+            <w:sz w:val="24"/>
+            <w:szCs w:val="24"/>
+            <w:color w:val="111827"/>
+            <w:b/>
+            <w:bCs/>
+            <w:u w:val="none"/>
+          </w:rPr>
+          <w:t xml:space="preserve">17</w:t>
         </w:r>
       </w:hyperlink>
     </w:p>
     <w:p>
       <w:pPr>
         <w:tabs>
-          <w:tab w:pos="8731" w:val="right" w:leader="dot"/>
+          <w:tab w:pos="8391" w:val="right" w:leader="dot"/>
         </w:tabs>
-        <w:spacing w:after="160"/>
-        <w:ind w:left="420"/>
+        <w:spacing w:line="240" w:lineRule="auto" w:before="40" w:after="80"/>
+        <w:ind w:left="408" w:right="85"/>
       </w:pPr>
       <w:hyperlink w:anchor="bm_h_17" w:history="1">
         <w:r>
@@ -949,17 +1193,33 @@
             <w:color w:val="111827"/>
             <w:u w:val="none"/>
           </w:rPr>
-          <w:t xml:space="preserve">5.1 功能测试	17</w:t>
+          <w:t xml:space="preserve">5.1 功能测试</w:t>
+        </w:r>
+      </w:hyperlink>
+      <w:r>
+        <w:tab/>
+      </w:r>
+      <w:hyperlink w:anchor="bm_h_17" w:history="1">
+        <w:r>
+          <w:rPr>
+            <w:rStyle w:val="Hyperlink"/>
+            <w:rFonts w:ascii="宋体" w:hAnsi="宋体" w:eastAsia="宋体"/>
+            <w:sz w:val="24"/>
+            <w:szCs w:val="24"/>
+            <w:color w:val="111827"/>
+            <w:u w:val="none"/>
+          </w:rPr>
+          <w:t xml:space="preserve">17</w:t>
         </w:r>
       </w:hyperlink>
     </w:p>
     <w:p>
       <w:pPr>
         <w:tabs>
-          <w:tab w:pos="8731" w:val="right" w:leader="dot"/>
+          <w:tab w:pos="8391" w:val="right" w:leader="dot"/>
         </w:tabs>
-        <w:spacing w:after="160"/>
-        <w:ind w:left="420"/>
+        <w:spacing w:line="240" w:lineRule="auto" w:before="40" w:after="80"/>
+        <w:ind w:left="408" w:right="85"/>
       </w:pPr>
       <w:hyperlink w:anchor="bm_h_18" w:history="1">
         <w:r>
@@ -971,22 +1231,33 @@
             <w:color w:val="111827"/>
             <w:u w:val="none"/>
           </w:rPr>
-          <w:t xml:space="preserve">5.2 构建测试	18</w:t>
+          <w:t xml:space="preserve">5.2 构建测试</w:t>
+        </w:r>
+      </w:hyperlink>
+      <w:r>
+        <w:tab/>
+      </w:r>
+      <w:hyperlink w:anchor="bm_h_18" w:history="1">
+        <w:r>
+          <w:rPr>
+            <w:rStyle w:val="Hyperlink"/>
+            <w:rFonts w:ascii="宋体" w:hAnsi="宋体" w:eastAsia="宋体"/>
+            <w:sz w:val="24"/>
+            <w:szCs w:val="24"/>
+            <w:color w:val="111827"/>
+            <w:u w:val="none"/>
+          </w:rPr>
+          <w:t xml:space="preserve">18</w:t>
         </w:r>
       </w:hyperlink>
     </w:p>
     <w:p>
-      <w:r>
-        <w:br w:type="page"/>
-      </w:r>
-    </w:p>
-    <w:p>
       <w:pPr>
         <w:tabs>
-          <w:tab w:pos="8731" w:val="right" w:leader="dot"/>
+          <w:tab w:pos="8391" w:val="right" w:leader="dot"/>
         </w:tabs>
-        <w:spacing w:after="160"/>
-        <w:ind w:left="420"/>
+        <w:spacing w:line="240" w:lineRule="auto" w:before="40" w:after="80"/>
+        <w:ind w:left="408" w:right="85"/>
       </w:pPr>
       <w:hyperlink w:anchor="bm_h_19" w:history="1">
         <w:r>
@@ -998,17 +1269,33 @@
             <w:color w:val="111827"/>
             <w:u w:val="none"/>
           </w:rPr>
-          <w:t xml:space="preserve">5.3 Demo 评估	18</w:t>
+          <w:t xml:space="preserve">5.3 Demo 评估</w:t>
+        </w:r>
+      </w:hyperlink>
+      <w:r>
+        <w:tab/>
+      </w:r>
+      <w:hyperlink w:anchor="bm_h_19" w:history="1">
+        <w:r>
+          <w:rPr>
+            <w:rStyle w:val="Hyperlink"/>
+            <w:rFonts w:ascii="宋体" w:hAnsi="宋体" w:eastAsia="宋体"/>
+            <w:sz w:val="24"/>
+            <w:szCs w:val="24"/>
+            <w:color w:val="111827"/>
+            <w:u w:val="none"/>
+          </w:rPr>
+          <w:t xml:space="preserve">18</w:t>
         </w:r>
       </w:hyperlink>
     </w:p>
     <w:p>
       <w:pPr>
         <w:tabs>
-          <w:tab w:pos="8731" w:val="right" w:leader="dot"/>
+          <w:tab w:pos="8391" w:val="right" w:leader="dot"/>
         </w:tabs>
-        <w:spacing w:after="160"/>
-        <w:ind w:left="0"/>
+        <w:spacing w:line="240" w:lineRule="auto" w:before="80" w:after="120"/>
+        <w:ind w:left="0" w:right="85"/>
       </w:pPr>
       <w:hyperlink w:anchor="bm_h_20" w:history="1">
         <w:r>
@@ -1022,17 +1309,35 @@
             <w:bCs/>
             <w:u w:val="none"/>
           </w:rPr>
-          <w:t xml:space="preserve">六、系统升级与扩展	19</w:t>
+          <w:t xml:space="preserve">六、系统升级与扩展</w:t>
+        </w:r>
+      </w:hyperlink>
+      <w:r>
+        <w:tab/>
+      </w:r>
+      <w:hyperlink w:anchor="bm_h_20" w:history="1">
+        <w:r>
+          <w:rPr>
+            <w:rStyle w:val="Hyperlink"/>
+            <w:rFonts w:ascii="宋体" w:hAnsi="宋体" w:eastAsia="宋体"/>
+            <w:sz w:val="24"/>
+            <w:szCs w:val="24"/>
+            <w:color w:val="111827"/>
+            <w:b/>
+            <w:bCs/>
+            <w:u w:val="none"/>
+          </w:rPr>
+          <w:t xml:space="preserve">19</w:t>
         </w:r>
       </w:hyperlink>
     </w:p>
     <w:p>
       <w:pPr>
         <w:tabs>
-          <w:tab w:pos="8731" w:val="right" w:leader="dot"/>
+          <w:tab w:pos="8391" w:val="right" w:leader="dot"/>
         </w:tabs>
-        <w:spacing w:after="160"/>
-        <w:ind w:left="0"/>
+        <w:spacing w:line="240" w:lineRule="auto" w:before="80" w:after="120"/>
+        <w:ind w:left="0" w:right="85"/>
       </w:pPr>
       <w:hyperlink w:anchor="bm_h_21" w:history="1">
         <w:r>
@@ -1046,17 +1351,35 @@
             <w:bCs/>
             <w:u w:val="none"/>
           </w:rPr>
-          <w:t xml:space="preserve">七、课程总结	20</w:t>
+          <w:t xml:space="preserve">七、课程总结</w:t>
+        </w:r>
+      </w:hyperlink>
+      <w:r>
+        <w:tab/>
+      </w:r>
+      <w:hyperlink w:anchor="bm_h_21" w:history="1">
+        <w:r>
+          <w:rPr>
+            <w:rStyle w:val="Hyperlink"/>
+            <w:rFonts w:ascii="宋体" w:hAnsi="宋体" w:eastAsia="宋体"/>
+            <w:sz w:val="24"/>
+            <w:szCs w:val="24"/>
+            <w:color w:val="111827"/>
+            <w:b/>
+            <w:bCs/>
+            <w:u w:val="none"/>
+          </w:rPr>
+          <w:t xml:space="preserve">20</w:t>
         </w:r>
       </w:hyperlink>
     </w:p>
     <w:p>
       <w:pPr>
         <w:tabs>
-          <w:tab w:pos="8731" w:val="right" w:leader="dot"/>
+          <w:tab w:pos="8391" w:val="right" w:leader="dot"/>
         </w:tabs>
-        <w:spacing w:after="160"/>
-        <w:ind w:left="0"/>
+        <w:spacing w:line="240" w:lineRule="auto" w:before="80" w:after="120"/>
+        <w:ind w:left="0" w:right="85"/>
       </w:pPr>
       <w:hyperlink w:anchor="bm_h_22" w:history="1">
         <w:r>
@@ -1070,17 +1393,35 @@
             <w:bCs/>
             <w:u w:val="none"/>
           </w:rPr>
-          <w:t xml:space="preserve">附录：运行方式	21</w:t>
+          <w:t xml:space="preserve">附录：运行方式</w:t>
+        </w:r>
+      </w:hyperlink>
+      <w:r>
+        <w:tab/>
+      </w:r>
+      <w:hyperlink w:anchor="bm_h_22" w:history="1">
+        <w:r>
+          <w:rPr>
+            <w:rStyle w:val="Hyperlink"/>
+            <w:rFonts w:ascii="宋体" w:hAnsi="宋体" w:eastAsia="宋体"/>
+            <w:sz w:val="24"/>
+            <w:szCs w:val="24"/>
+            <w:color w:val="111827"/>
+            <w:b/>
+            <w:bCs/>
+            <w:u w:val="none"/>
+          </w:rPr>
+          <w:t xml:space="preserve">21</w:t>
         </w:r>
       </w:hyperlink>
     </w:p>
     <w:p>
       <w:pPr>
         <w:tabs>
-          <w:tab w:pos="8731" w:val="right" w:leader="dot"/>
+          <w:tab w:pos="8391" w:val="right" w:leader="dot"/>
         </w:tabs>
-        <w:spacing w:after="160"/>
-        <w:ind w:left="420"/>
+        <w:spacing w:line="240" w:lineRule="auto" w:before="40" w:after="80"/>
+        <w:ind w:left="408" w:right="85"/>
       </w:pPr>
       <w:hyperlink w:anchor="bm_h_23" w:history="1">
         <w:r>
@@ -1092,17 +1433,33 @@
             <w:color w:val="111827"/>
             <w:u w:val="none"/>
           </w:rPr>
-          <w:t xml:space="preserve">附录 A：项目文件与交付物对照	21</w:t>
+          <w:t xml:space="preserve">附录 A：项目文件与交付物对照</w:t>
+        </w:r>
+      </w:hyperlink>
+      <w:r>
+        <w:tab/>
+      </w:r>
+      <w:hyperlink w:anchor="bm_h_23" w:history="1">
+        <w:r>
+          <w:rPr>
+            <w:rStyle w:val="Hyperlink"/>
+            <w:rFonts w:ascii="宋体" w:hAnsi="宋体" w:eastAsia="宋体"/>
+            <w:sz w:val="24"/>
+            <w:szCs w:val="24"/>
+            <w:color w:val="111827"/>
+            <w:u w:val="none"/>
+          </w:rPr>
+          <w:t xml:space="preserve">21</w:t>
         </w:r>
       </w:hyperlink>
     </w:p>
     <w:p>
       <w:pPr>
         <w:tabs>
-          <w:tab w:pos="8731" w:val="right" w:leader="dot"/>
+          <w:tab w:pos="8391" w:val="right" w:leader="dot"/>
         </w:tabs>
-        <w:spacing w:after="160"/>
-        <w:ind w:left="420"/>
+        <w:spacing w:line="240" w:lineRule="auto" w:before="40" w:after="80"/>
+        <w:ind w:left="408" w:right="85"/>
       </w:pPr>
       <w:hyperlink w:anchor="bm_h_24" w:history="1">
         <w:r>
@@ -1114,7 +1471,23 @@
             <w:color w:val="111827"/>
             <w:u w:val="none"/>
           </w:rPr>
-          <w:t xml:space="preserve">附录 B：关键术语说明	22</w:t>
+          <w:t xml:space="preserve">附录 B：关键术语说明</w:t>
+        </w:r>
+      </w:hyperlink>
+      <w:r>
+        <w:tab/>
+      </w:r>
+      <w:hyperlink w:anchor="bm_h_24" w:history="1">
+        <w:r>
+          <w:rPr>
+            <w:rStyle w:val="Hyperlink"/>
+            <w:rFonts w:ascii="宋体" w:hAnsi="宋体" w:eastAsia="宋体"/>
+            <w:sz w:val="24"/>
+            <w:szCs w:val="24"/>
+            <w:color w:val="111827"/>
+            <w:u w:val="none"/>
+          </w:rPr>
+          <w:t xml:space="preserve">22</w:t>
         </w:r>
       </w:hyperlink>
     </w:p>

</xml_diff>

<commit_message>
Use native Word TOC field
</commit_message>
<xml_diff>
--- a/docs/CS599_大作业报告.docx
+++ b/docs/CS599_大作业报告.docx
@@ -529,7 +529,6 @@
     <w:p>
       <w:bookmarkStart w:id="1" w:name="toc"/>
       <w:pPr>
-        <w:pStyle w:val="Heading1"/>
         <w:spacing w:before="1000" w:after="480"/>
         <w:jc w:val="center"/>
       </w:pPr>
@@ -545,951 +544,28 @@
     </w:p>
     <w:p>
       <w:pPr>
-        <w:tabs>
-          <w:tab w:pos="8391" w:val="right" w:leader="dot"/>
-        </w:tabs>
-        <w:spacing w:line="240" w:lineRule="auto" w:before="80" w:after="120"/>
-        <w:ind w:left="0" w:right="85"/>
+        <w:spacing w:line="276" w:lineRule="auto" w:after="160"/>
       </w:pPr>
-      <w:hyperlink w:anchor="bm_h_1" w:history="1">
-        <w:r>
-          <w:rPr>
-            <w:rStyle w:val="Hyperlink"/>
-            <w:rFonts w:ascii="宋体" w:hAnsi="宋体" w:eastAsia="宋体"/>
-            <w:sz w:val="24"/>
-            <w:szCs w:val="24"/>
-            <w:color w:val="111827"/>
-            <w:b/>
-            <w:bCs/>
-            <w:u w:val="none"/>
-          </w:rPr>
-          <w:t xml:space="preserve">摘要</w:t>
-        </w:r>
-      </w:hyperlink>
       <w:r>
-        <w:tab/>
+        <w:fldChar w:fldCharType="begin"/>
       </w:r>
-      <w:hyperlink w:anchor="bm_h_1" w:history="1">
-        <w:r>
-          <w:rPr>
-            <w:rStyle w:val="Hyperlink"/>
-            <w:rFonts w:ascii="宋体" w:hAnsi="宋体" w:eastAsia="宋体"/>
-            <w:sz w:val="24"/>
-            <w:szCs w:val="24"/>
-            <w:color w:val="111827"/>
-            <w:b/>
-            <w:bCs/>
-            <w:u w:val="none"/>
-          </w:rPr>
-          <w:t xml:space="preserve">3</w:t>
-        </w:r>
-      </w:hyperlink>
-    </w:p>
-    <w:p>
-      <w:pPr>
-        <w:tabs>
-          <w:tab w:pos="8391" w:val="right" w:leader="dot"/>
-        </w:tabs>
-        <w:spacing w:line="240" w:lineRule="auto" w:before="80" w:after="120"/>
-        <w:ind w:left="0" w:right="85"/>
-      </w:pPr>
-      <w:hyperlink w:anchor="bm_h_2" w:history="1">
-        <w:r>
-          <w:rPr>
-            <w:rStyle w:val="Hyperlink"/>
-            <w:rFonts w:ascii="宋体" w:hAnsi="宋体" w:eastAsia="宋体"/>
-            <w:sz w:val="24"/>
-            <w:szCs w:val="24"/>
-            <w:color w:val="111827"/>
-            <w:b/>
-            <w:bCs/>
-            <w:u w:val="none"/>
-          </w:rPr>
-          <w:t xml:space="preserve">一、选题背景与设计思想</w:t>
-        </w:r>
-      </w:hyperlink>
       <w:r>
-        <w:tab/>
+        <w:instrText xml:space="preserve">TOC \o "1-2" \h \z \u</w:instrText>
       </w:r>
-      <w:hyperlink w:anchor="bm_h_2" w:history="1">
-        <w:r>
-          <w:rPr>
-            <w:rStyle w:val="Hyperlink"/>
-            <w:rFonts w:ascii="宋体" w:hAnsi="宋体" w:eastAsia="宋体"/>
-            <w:sz w:val="24"/>
-            <w:szCs w:val="24"/>
-            <w:color w:val="111827"/>
-            <w:b/>
-            <w:bCs/>
-            <w:u w:val="none"/>
-          </w:rPr>
-          <w:t xml:space="preserve">4</w:t>
-        </w:r>
-      </w:hyperlink>
-    </w:p>
-    <w:p>
-      <w:pPr>
-        <w:tabs>
-          <w:tab w:pos="8391" w:val="right" w:leader="dot"/>
-        </w:tabs>
-        <w:spacing w:line="240" w:lineRule="auto" w:before="80" w:after="120"/>
-        <w:ind w:left="0" w:right="85"/>
-      </w:pPr>
-      <w:hyperlink w:anchor="bm_h_3" w:history="1">
-        <w:r>
-          <w:rPr>
-            <w:rStyle w:val="Hyperlink"/>
-            <w:rFonts w:ascii="宋体" w:hAnsi="宋体" w:eastAsia="宋体"/>
-            <w:sz w:val="24"/>
-            <w:szCs w:val="24"/>
-            <w:color w:val="111827"/>
-            <w:b/>
-            <w:bCs/>
-            <w:u w:val="none"/>
-          </w:rPr>
-          <w:t xml:space="preserve">二、Specs 规格设计</w:t>
-        </w:r>
-      </w:hyperlink>
       <w:r>
-        <w:tab/>
+        <w:fldChar w:fldCharType="separate"/>
       </w:r>
-      <w:hyperlink w:anchor="bm_h_3" w:history="1">
-        <w:r>
-          <w:rPr>
-            <w:rStyle w:val="Hyperlink"/>
-            <w:rFonts w:ascii="宋体" w:hAnsi="宋体" w:eastAsia="宋体"/>
-            <w:sz w:val="24"/>
-            <w:szCs w:val="24"/>
-            <w:color w:val="111827"/>
-            <w:b/>
-            <w:bCs/>
-            <w:u w:val="none"/>
-          </w:rPr>
-          <w:t xml:space="preserve">5</w:t>
-        </w:r>
-      </w:hyperlink>
-    </w:p>
-    <w:p>
-      <w:pPr>
-        <w:tabs>
-          <w:tab w:pos="8391" w:val="right" w:leader="dot"/>
-        </w:tabs>
-        <w:spacing w:line="240" w:lineRule="auto" w:before="40" w:after="80"/>
-        <w:ind w:left="408" w:right="85"/>
-      </w:pPr>
-      <w:hyperlink w:anchor="bm_h_4" w:history="1">
-        <w:r>
-          <w:rPr>
-            <w:rStyle w:val="Hyperlink"/>
-            <w:rFonts w:ascii="宋体" w:hAnsi="宋体" w:eastAsia="宋体"/>
-            <w:sz w:val="24"/>
-            <w:szCs w:val="24"/>
-            <w:color w:val="111827"/>
-            <w:u w:val="none"/>
-          </w:rPr>
-          <w:t xml:space="preserve">2.1 Product Spec</w:t>
-        </w:r>
-      </w:hyperlink>
       <w:r>
-        <w:tab/>
+        <w:rPr>
+          <w:rFonts w:ascii="宋体" w:hAnsi="宋体" w:eastAsia="宋体"/>
+          <w:color w:val="6B7280"/>
+          <w:sz w:val="24"/>
+        </w:rPr>
+        <w:t>请在 Word 中右键此处，选择“更新域/更新目录”生成目录。</w:t>
       </w:r>
-      <w:hyperlink w:anchor="bm_h_4" w:history="1">
-        <w:r>
-          <w:rPr>
-            <w:rStyle w:val="Hyperlink"/>
-            <w:rFonts w:ascii="宋体" w:hAnsi="宋体" w:eastAsia="宋体"/>
-            <w:sz w:val="24"/>
-            <w:szCs w:val="24"/>
-            <w:color w:val="111827"/>
-            <w:u w:val="none"/>
-          </w:rPr>
-          <w:t xml:space="preserve">5</w:t>
-        </w:r>
-      </w:hyperlink>
-    </w:p>
-    <w:p>
-      <w:pPr>
-        <w:tabs>
-          <w:tab w:pos="8391" w:val="right" w:leader="dot"/>
-        </w:tabs>
-        <w:spacing w:line="240" w:lineRule="auto" w:before="40" w:after="80"/>
-        <w:ind w:left="408" w:right="85"/>
-      </w:pPr>
-      <w:hyperlink w:anchor="bm_h_5" w:history="1">
-        <w:r>
-          <w:rPr>
-            <w:rStyle w:val="Hyperlink"/>
-            <w:rFonts w:ascii="宋体" w:hAnsi="宋体" w:eastAsia="宋体"/>
-            <w:sz w:val="24"/>
-            <w:szCs w:val="24"/>
-            <w:color w:val="111827"/>
-            <w:u w:val="none"/>
-          </w:rPr>
-          <w:t xml:space="preserve">2.2 API Spec</w:t>
-        </w:r>
-      </w:hyperlink>
       <w:r>
-        <w:tab/>
+        <w:fldChar w:fldCharType="end"/>
       </w:r>
-      <w:hyperlink w:anchor="bm_h_5" w:history="1">
-        <w:r>
-          <w:rPr>
-            <w:rStyle w:val="Hyperlink"/>
-            <w:rFonts w:ascii="宋体" w:hAnsi="宋体" w:eastAsia="宋体"/>
-            <w:sz w:val="24"/>
-            <w:szCs w:val="24"/>
-            <w:color w:val="111827"/>
-            <w:u w:val="none"/>
-          </w:rPr>
-          <w:t xml:space="preserve">7</w:t>
-        </w:r>
-      </w:hyperlink>
-    </w:p>
-    <w:p>
-      <w:pPr>
-        <w:tabs>
-          <w:tab w:pos="8391" w:val="right" w:leader="dot"/>
-        </w:tabs>
-        <w:spacing w:line="240" w:lineRule="auto" w:before="40" w:after="80"/>
-        <w:ind w:left="408" w:right="85"/>
-      </w:pPr>
-      <w:hyperlink w:anchor="bm_h_6" w:history="1">
-        <w:r>
-          <w:rPr>
-            <w:rStyle w:val="Hyperlink"/>
-            <w:rFonts w:ascii="宋体" w:hAnsi="宋体" w:eastAsia="宋体"/>
-            <w:sz w:val="24"/>
-            <w:szCs w:val="24"/>
-            <w:color w:val="111827"/>
-            <w:u w:val="none"/>
-          </w:rPr>
-          <w:t xml:space="preserve">2.3 SDD 核心</w:t>
-        </w:r>
-      </w:hyperlink>
-      <w:r>
-        <w:tab/>
-      </w:r>
-      <w:hyperlink w:anchor="bm_h_6" w:history="1">
-        <w:r>
-          <w:rPr>
-            <w:rStyle w:val="Hyperlink"/>
-            <w:rFonts w:ascii="宋体" w:hAnsi="宋体" w:eastAsia="宋体"/>
-            <w:sz w:val="24"/>
-            <w:szCs w:val="24"/>
-            <w:color w:val="111827"/>
-            <w:u w:val="none"/>
-          </w:rPr>
-          <w:t xml:space="preserve">8</w:t>
-        </w:r>
-      </w:hyperlink>
-    </w:p>
-    <w:p>
-      <w:pPr>
-        <w:tabs>
-          <w:tab w:pos="8391" w:val="right" w:leader="dot"/>
-        </w:tabs>
-        <w:spacing w:line="240" w:lineRule="auto" w:before="80" w:after="120"/>
-        <w:ind w:left="0" w:right="85"/>
-      </w:pPr>
-      <w:hyperlink w:anchor="bm_h_7" w:history="1">
-        <w:r>
-          <w:rPr>
-            <w:rStyle w:val="Hyperlink"/>
-            <w:rFonts w:ascii="宋体" w:hAnsi="宋体" w:eastAsia="宋体"/>
-            <w:sz w:val="24"/>
-            <w:szCs w:val="24"/>
-            <w:color w:val="111827"/>
-            <w:b/>
-            <w:bCs/>
-            <w:u w:val="none"/>
-          </w:rPr>
-          <w:t xml:space="preserve">三、系统架构与设计</w:t>
-        </w:r>
-      </w:hyperlink>
-      <w:r>
-        <w:tab/>
-      </w:r>
-      <w:hyperlink w:anchor="bm_h_7" w:history="1">
-        <w:r>
-          <w:rPr>
-            <w:rStyle w:val="Hyperlink"/>
-            <w:rFonts w:ascii="宋体" w:hAnsi="宋体" w:eastAsia="宋体"/>
-            <w:sz w:val="24"/>
-            <w:szCs w:val="24"/>
-            <w:color w:val="111827"/>
-            <w:b/>
-            <w:bCs/>
-            <w:u w:val="none"/>
-          </w:rPr>
-          <w:t xml:space="preserve">9</w:t>
-        </w:r>
-      </w:hyperlink>
-    </w:p>
-    <w:p>
-      <w:pPr>
-        <w:tabs>
-          <w:tab w:pos="8391" w:val="right" w:leader="dot"/>
-        </w:tabs>
-        <w:spacing w:line="240" w:lineRule="auto" w:before="40" w:after="80"/>
-        <w:ind w:left="408" w:right="85"/>
-      </w:pPr>
-      <w:hyperlink w:anchor="bm_h_8" w:history="1">
-        <w:r>
-          <w:rPr>
-            <w:rStyle w:val="Hyperlink"/>
-            <w:rFonts w:ascii="宋体" w:hAnsi="宋体" w:eastAsia="宋体"/>
-            <w:sz w:val="24"/>
-            <w:szCs w:val="24"/>
-            <w:color w:val="111827"/>
-            <w:u w:val="none"/>
-          </w:rPr>
-          <w:t xml:space="preserve">3.1 总体架构</w:t>
-        </w:r>
-      </w:hyperlink>
-      <w:r>
-        <w:tab/>
-      </w:r>
-      <w:hyperlink w:anchor="bm_h_8" w:history="1">
-        <w:r>
-          <w:rPr>
-            <w:rStyle w:val="Hyperlink"/>
-            <w:rFonts w:ascii="宋体" w:hAnsi="宋体" w:eastAsia="宋体"/>
-            <w:sz w:val="24"/>
-            <w:szCs w:val="24"/>
-            <w:color w:val="111827"/>
-            <w:u w:val="none"/>
-          </w:rPr>
-          <w:t xml:space="preserve">9</w:t>
-        </w:r>
-      </w:hyperlink>
-    </w:p>
-    <w:p>
-      <w:pPr>
-        <w:tabs>
-          <w:tab w:pos="8391" w:val="right" w:leader="dot"/>
-        </w:tabs>
-        <w:spacing w:line="240" w:lineRule="auto" w:before="40" w:after="80"/>
-        <w:ind w:left="408" w:right="85"/>
-      </w:pPr>
-      <w:hyperlink w:anchor="bm_h_9" w:history="1">
-        <w:r>
-          <w:rPr>
-            <w:rStyle w:val="Hyperlink"/>
-            <w:rFonts w:ascii="宋体" w:hAnsi="宋体" w:eastAsia="宋体"/>
-            <w:sz w:val="24"/>
-            <w:szCs w:val="24"/>
-            <w:color w:val="111827"/>
-            <w:u w:val="none"/>
-          </w:rPr>
-          <w:t xml:space="preserve">3.2 Agent 交互流程</w:t>
-        </w:r>
-      </w:hyperlink>
-      <w:r>
-        <w:tab/>
-      </w:r>
-      <w:hyperlink w:anchor="bm_h_9" w:history="1">
-        <w:r>
-          <w:rPr>
-            <w:rStyle w:val="Hyperlink"/>
-            <w:rFonts w:ascii="宋体" w:hAnsi="宋体" w:eastAsia="宋体"/>
-            <w:sz w:val="24"/>
-            <w:szCs w:val="24"/>
-            <w:color w:val="111827"/>
-            <w:u w:val="none"/>
-          </w:rPr>
-          <w:t xml:space="preserve">10</w:t>
-        </w:r>
-      </w:hyperlink>
-    </w:p>
-    <w:p>
-      <w:pPr>
-        <w:tabs>
-          <w:tab w:pos="8391" w:val="right" w:leader="dot"/>
-        </w:tabs>
-        <w:spacing w:line="240" w:lineRule="auto" w:before="40" w:after="80"/>
-        <w:ind w:left="408" w:right="85"/>
-      </w:pPr>
-      <w:hyperlink w:anchor="bm_h_10" w:history="1">
-        <w:r>
-          <w:rPr>
-            <w:rStyle w:val="Hyperlink"/>
-            <w:rFonts w:ascii="宋体" w:hAnsi="宋体" w:eastAsia="宋体"/>
-            <w:sz w:val="24"/>
-            <w:szCs w:val="24"/>
-            <w:color w:val="111827"/>
-            <w:u w:val="none"/>
-          </w:rPr>
-          <w:t xml:space="preserve">3.3 数据设计</w:t>
-        </w:r>
-      </w:hyperlink>
-      <w:r>
-        <w:tab/>
-      </w:r>
-      <w:hyperlink w:anchor="bm_h_10" w:history="1">
-        <w:r>
-          <w:rPr>
-            <w:rStyle w:val="Hyperlink"/>
-            <w:rFonts w:ascii="宋体" w:hAnsi="宋体" w:eastAsia="宋体"/>
-            <w:sz w:val="24"/>
-            <w:szCs w:val="24"/>
-            <w:color w:val="111827"/>
-            <w:u w:val="none"/>
-          </w:rPr>
-          <w:t xml:space="preserve">12</w:t>
-        </w:r>
-      </w:hyperlink>
-    </w:p>
-    <w:p>
-      <w:pPr>
-        <w:tabs>
-          <w:tab w:pos="8391" w:val="right" w:leader="dot"/>
-        </w:tabs>
-        <w:spacing w:line="240" w:lineRule="auto" w:before="80" w:after="120"/>
-        <w:ind w:left="0" w:right="85"/>
-      </w:pPr>
-      <w:hyperlink w:anchor="bm_h_11" w:history="1">
-        <w:r>
-          <w:rPr>
-            <w:rStyle w:val="Hyperlink"/>
-            <w:rFonts w:ascii="宋体" w:hAnsi="宋体" w:eastAsia="宋体"/>
-            <w:sz w:val="24"/>
-            <w:szCs w:val="24"/>
-            <w:color w:val="111827"/>
-            <w:b/>
-            <w:bCs/>
-            <w:u w:val="none"/>
-          </w:rPr>
-          <w:t xml:space="preserve">四、关键实现与代码展示</w:t>
-        </w:r>
-      </w:hyperlink>
-      <w:r>
-        <w:tab/>
-      </w:r>
-      <w:hyperlink w:anchor="bm_h_11" w:history="1">
-        <w:r>
-          <w:rPr>
-            <w:rStyle w:val="Hyperlink"/>
-            <w:rFonts w:ascii="宋体" w:hAnsi="宋体" w:eastAsia="宋体"/>
-            <w:sz w:val="24"/>
-            <w:szCs w:val="24"/>
-            <w:color w:val="111827"/>
-            <w:b/>
-            <w:bCs/>
-            <w:u w:val="none"/>
-          </w:rPr>
-          <w:t xml:space="preserve">13</w:t>
-        </w:r>
-      </w:hyperlink>
-    </w:p>
-    <w:p>
-      <w:pPr>
-        <w:tabs>
-          <w:tab w:pos="8391" w:val="right" w:leader="dot"/>
-        </w:tabs>
-        <w:spacing w:line="240" w:lineRule="auto" w:before="40" w:after="80"/>
-        <w:ind w:left="408" w:right="85"/>
-      </w:pPr>
-      <w:hyperlink w:anchor="bm_h_12" w:history="1">
-        <w:r>
-          <w:rPr>
-            <w:rStyle w:val="Hyperlink"/>
-            <w:rFonts w:ascii="宋体" w:hAnsi="宋体" w:eastAsia="宋体"/>
-            <w:sz w:val="24"/>
-            <w:szCs w:val="24"/>
-            <w:color w:val="111827"/>
-            <w:u w:val="none"/>
-          </w:rPr>
-          <w:t xml:space="preserve">4.1 LegalAgentService</w:t>
-        </w:r>
-      </w:hyperlink>
-      <w:r>
-        <w:tab/>
-      </w:r>
-      <w:hyperlink w:anchor="bm_h_12" w:history="1">
-        <w:r>
-          <w:rPr>
-            <w:rStyle w:val="Hyperlink"/>
-            <w:rFonts w:ascii="宋体" w:hAnsi="宋体" w:eastAsia="宋体"/>
-            <w:sz w:val="24"/>
-            <w:szCs w:val="24"/>
-            <w:color w:val="111827"/>
-            <w:u w:val="none"/>
-          </w:rPr>
-          <w:t xml:space="preserve">13</w:t>
-        </w:r>
-      </w:hyperlink>
-    </w:p>
-    <w:p>
-      <w:pPr>
-        <w:tabs>
-          <w:tab w:pos="8391" w:val="right" w:leader="dot"/>
-        </w:tabs>
-        <w:spacing w:line="240" w:lineRule="auto" w:before="40" w:after="80"/>
-        <w:ind w:left="408" w:right="85"/>
-      </w:pPr>
-      <w:hyperlink w:anchor="bm_h_13" w:history="1">
-        <w:r>
-          <w:rPr>
-            <w:rStyle w:val="Hyperlink"/>
-            <w:rFonts w:ascii="宋体" w:hAnsi="宋体" w:eastAsia="宋体"/>
-            <w:sz w:val="24"/>
-            <w:szCs w:val="24"/>
-            <w:color w:val="111827"/>
-            <w:u w:val="none"/>
-          </w:rPr>
-          <w:t xml:space="preserve">4.2 RAG 与知识库</w:t>
-        </w:r>
-      </w:hyperlink>
-      <w:r>
-        <w:tab/>
-      </w:r>
-      <w:hyperlink w:anchor="bm_h_13" w:history="1">
-        <w:r>
-          <w:rPr>
-            <w:rStyle w:val="Hyperlink"/>
-            <w:rFonts w:ascii="宋体" w:hAnsi="宋体" w:eastAsia="宋体"/>
-            <w:sz w:val="24"/>
-            <w:szCs w:val="24"/>
-            <w:color w:val="111827"/>
-            <w:u w:val="none"/>
-          </w:rPr>
-          <w:t xml:space="preserve">14</w:t>
-        </w:r>
-      </w:hyperlink>
-    </w:p>
-    <w:p>
-      <w:pPr>
-        <w:tabs>
-          <w:tab w:pos="8391" w:val="right" w:leader="dot"/>
-        </w:tabs>
-        <w:spacing w:line="240" w:lineRule="auto" w:before="40" w:after="80"/>
-        <w:ind w:left="408" w:right="85"/>
-      </w:pPr>
-      <w:hyperlink w:anchor="bm_h_14" w:history="1">
-        <w:r>
-          <w:rPr>
-            <w:rStyle w:val="Hyperlink"/>
-            <w:rFonts w:ascii="宋体" w:hAnsi="宋体" w:eastAsia="宋体"/>
-            <w:sz w:val="24"/>
-            <w:szCs w:val="24"/>
-            <w:color w:val="111827"/>
-            <w:u w:val="none"/>
-          </w:rPr>
-          <w:t xml:space="preserve">4.3 前端交互</w:t>
-        </w:r>
-      </w:hyperlink>
-      <w:r>
-        <w:tab/>
-      </w:r>
-      <w:hyperlink w:anchor="bm_h_14" w:history="1">
-        <w:r>
-          <w:rPr>
-            <w:rStyle w:val="Hyperlink"/>
-            <w:rFonts w:ascii="宋体" w:hAnsi="宋体" w:eastAsia="宋体"/>
-            <w:sz w:val="24"/>
-            <w:szCs w:val="24"/>
-            <w:color w:val="111827"/>
-            <w:u w:val="none"/>
-          </w:rPr>
-          <w:t xml:space="preserve">15</w:t>
-        </w:r>
-      </w:hyperlink>
-    </w:p>
-    <w:p>
-      <w:pPr>
-        <w:tabs>
-          <w:tab w:pos="8391" w:val="right" w:leader="dot"/>
-        </w:tabs>
-        <w:spacing w:line="240" w:lineRule="auto" w:before="40" w:after="80"/>
-        <w:ind w:left="408" w:right="85"/>
-      </w:pPr>
-      <w:hyperlink w:anchor="bm_h_15" w:history="1">
-        <w:r>
-          <w:rPr>
-            <w:rStyle w:val="Hyperlink"/>
-            <w:rFonts w:ascii="宋体" w:hAnsi="宋体" w:eastAsia="宋体"/>
-            <w:sz w:val="24"/>
-            <w:szCs w:val="24"/>
-            <w:color w:val="111827"/>
-            <w:u w:val="none"/>
-          </w:rPr>
-          <w:t xml:space="preserve">4.4 安全边界</w:t>
-        </w:r>
-      </w:hyperlink>
-      <w:r>
-        <w:tab/>
-      </w:r>
-      <w:hyperlink w:anchor="bm_h_15" w:history="1">
-        <w:r>
-          <w:rPr>
-            <w:rStyle w:val="Hyperlink"/>
-            <w:rFonts w:ascii="宋体" w:hAnsi="宋体" w:eastAsia="宋体"/>
-            <w:sz w:val="24"/>
-            <w:szCs w:val="24"/>
-            <w:color w:val="111827"/>
-            <w:u w:val="none"/>
-          </w:rPr>
-          <w:t xml:space="preserve">16</w:t>
-        </w:r>
-      </w:hyperlink>
-    </w:p>
-    <w:p>
-      <w:pPr>
-        <w:tabs>
-          <w:tab w:pos="8391" w:val="right" w:leader="dot"/>
-        </w:tabs>
-        <w:spacing w:line="240" w:lineRule="auto" w:before="80" w:after="120"/>
-        <w:ind w:left="0" w:right="85"/>
-      </w:pPr>
-      <w:hyperlink w:anchor="bm_h_16" w:history="1">
-        <w:r>
-          <w:rPr>
-            <w:rStyle w:val="Hyperlink"/>
-            <w:rFonts w:ascii="宋体" w:hAnsi="宋体" w:eastAsia="宋体"/>
-            <w:sz w:val="24"/>
-            <w:szCs w:val="24"/>
-            <w:color w:val="111827"/>
-            <w:b/>
-            <w:bCs/>
-            <w:u w:val="none"/>
-          </w:rPr>
-          <w:t xml:space="preserve">五、测试与评估</w:t>
-        </w:r>
-      </w:hyperlink>
-      <w:r>
-        <w:tab/>
-      </w:r>
-      <w:hyperlink w:anchor="bm_h_16" w:history="1">
-        <w:r>
-          <w:rPr>
-            <w:rStyle w:val="Hyperlink"/>
-            <w:rFonts w:ascii="宋体" w:hAnsi="宋体" w:eastAsia="宋体"/>
-            <w:sz w:val="24"/>
-            <w:szCs w:val="24"/>
-            <w:color w:val="111827"/>
-            <w:b/>
-            <w:bCs/>
-            <w:u w:val="none"/>
-          </w:rPr>
-          <w:t xml:space="preserve">17</w:t>
-        </w:r>
-      </w:hyperlink>
-    </w:p>
-    <w:p>
-      <w:pPr>
-        <w:tabs>
-          <w:tab w:pos="8391" w:val="right" w:leader="dot"/>
-        </w:tabs>
-        <w:spacing w:line="240" w:lineRule="auto" w:before="40" w:after="80"/>
-        <w:ind w:left="408" w:right="85"/>
-      </w:pPr>
-      <w:hyperlink w:anchor="bm_h_17" w:history="1">
-        <w:r>
-          <w:rPr>
-            <w:rStyle w:val="Hyperlink"/>
-            <w:rFonts w:ascii="宋体" w:hAnsi="宋体" w:eastAsia="宋体"/>
-            <w:sz w:val="24"/>
-            <w:szCs w:val="24"/>
-            <w:color w:val="111827"/>
-            <w:u w:val="none"/>
-          </w:rPr>
-          <w:t xml:space="preserve">5.1 功能测试</w:t>
-        </w:r>
-      </w:hyperlink>
-      <w:r>
-        <w:tab/>
-      </w:r>
-      <w:hyperlink w:anchor="bm_h_17" w:history="1">
-        <w:r>
-          <w:rPr>
-            <w:rStyle w:val="Hyperlink"/>
-            <w:rFonts w:ascii="宋体" w:hAnsi="宋体" w:eastAsia="宋体"/>
-            <w:sz w:val="24"/>
-            <w:szCs w:val="24"/>
-            <w:color w:val="111827"/>
-            <w:u w:val="none"/>
-          </w:rPr>
-          <w:t xml:space="preserve">17</w:t>
-        </w:r>
-      </w:hyperlink>
-    </w:p>
-    <w:p>
-      <w:pPr>
-        <w:tabs>
-          <w:tab w:pos="8391" w:val="right" w:leader="dot"/>
-        </w:tabs>
-        <w:spacing w:line="240" w:lineRule="auto" w:before="40" w:after="80"/>
-        <w:ind w:left="408" w:right="85"/>
-      </w:pPr>
-      <w:hyperlink w:anchor="bm_h_18" w:history="1">
-        <w:r>
-          <w:rPr>
-            <w:rStyle w:val="Hyperlink"/>
-            <w:rFonts w:ascii="宋体" w:hAnsi="宋体" w:eastAsia="宋体"/>
-            <w:sz w:val="24"/>
-            <w:szCs w:val="24"/>
-            <w:color w:val="111827"/>
-            <w:u w:val="none"/>
-          </w:rPr>
-          <w:t xml:space="preserve">5.2 构建测试</w:t>
-        </w:r>
-      </w:hyperlink>
-      <w:r>
-        <w:tab/>
-      </w:r>
-      <w:hyperlink w:anchor="bm_h_18" w:history="1">
-        <w:r>
-          <w:rPr>
-            <w:rStyle w:val="Hyperlink"/>
-            <w:rFonts w:ascii="宋体" w:hAnsi="宋体" w:eastAsia="宋体"/>
-            <w:sz w:val="24"/>
-            <w:szCs w:val="24"/>
-            <w:color w:val="111827"/>
-            <w:u w:val="none"/>
-          </w:rPr>
-          <w:t xml:space="preserve">18</w:t>
-        </w:r>
-      </w:hyperlink>
-    </w:p>
-    <w:p>
-      <w:pPr>
-        <w:tabs>
-          <w:tab w:pos="8391" w:val="right" w:leader="dot"/>
-        </w:tabs>
-        <w:spacing w:line="240" w:lineRule="auto" w:before="40" w:after="80"/>
-        <w:ind w:left="408" w:right="85"/>
-      </w:pPr>
-      <w:hyperlink w:anchor="bm_h_19" w:history="1">
-        <w:r>
-          <w:rPr>
-            <w:rStyle w:val="Hyperlink"/>
-            <w:rFonts w:ascii="宋体" w:hAnsi="宋体" w:eastAsia="宋体"/>
-            <w:sz w:val="24"/>
-            <w:szCs w:val="24"/>
-            <w:color w:val="111827"/>
-            <w:u w:val="none"/>
-          </w:rPr>
-          <w:t xml:space="preserve">5.3 Demo 评估</w:t>
-        </w:r>
-      </w:hyperlink>
-      <w:r>
-        <w:tab/>
-      </w:r>
-      <w:hyperlink w:anchor="bm_h_19" w:history="1">
-        <w:r>
-          <w:rPr>
-            <w:rStyle w:val="Hyperlink"/>
-            <w:rFonts w:ascii="宋体" w:hAnsi="宋体" w:eastAsia="宋体"/>
-            <w:sz w:val="24"/>
-            <w:szCs w:val="24"/>
-            <w:color w:val="111827"/>
-            <w:u w:val="none"/>
-          </w:rPr>
-          <w:t xml:space="preserve">18</w:t>
-        </w:r>
-      </w:hyperlink>
-    </w:p>
-    <w:p>
-      <w:pPr>
-        <w:tabs>
-          <w:tab w:pos="8391" w:val="right" w:leader="dot"/>
-        </w:tabs>
-        <w:spacing w:line="240" w:lineRule="auto" w:before="80" w:after="120"/>
-        <w:ind w:left="0" w:right="85"/>
-      </w:pPr>
-      <w:hyperlink w:anchor="bm_h_20" w:history="1">
-        <w:r>
-          <w:rPr>
-            <w:rStyle w:val="Hyperlink"/>
-            <w:rFonts w:ascii="宋体" w:hAnsi="宋体" w:eastAsia="宋体"/>
-            <w:sz w:val="24"/>
-            <w:szCs w:val="24"/>
-            <w:color w:val="111827"/>
-            <w:b/>
-            <w:bCs/>
-            <w:u w:val="none"/>
-          </w:rPr>
-          <w:t xml:space="preserve">六、系统升级与扩展</w:t>
-        </w:r>
-      </w:hyperlink>
-      <w:r>
-        <w:tab/>
-      </w:r>
-      <w:hyperlink w:anchor="bm_h_20" w:history="1">
-        <w:r>
-          <w:rPr>
-            <w:rStyle w:val="Hyperlink"/>
-            <w:rFonts w:ascii="宋体" w:hAnsi="宋体" w:eastAsia="宋体"/>
-            <w:sz w:val="24"/>
-            <w:szCs w:val="24"/>
-            <w:color w:val="111827"/>
-            <w:b/>
-            <w:bCs/>
-            <w:u w:val="none"/>
-          </w:rPr>
-          <w:t xml:space="preserve">19</w:t>
-        </w:r>
-      </w:hyperlink>
-    </w:p>
-    <w:p>
-      <w:pPr>
-        <w:tabs>
-          <w:tab w:pos="8391" w:val="right" w:leader="dot"/>
-        </w:tabs>
-        <w:spacing w:line="240" w:lineRule="auto" w:before="80" w:after="120"/>
-        <w:ind w:left="0" w:right="85"/>
-      </w:pPr>
-      <w:hyperlink w:anchor="bm_h_21" w:history="1">
-        <w:r>
-          <w:rPr>
-            <w:rStyle w:val="Hyperlink"/>
-            <w:rFonts w:ascii="宋体" w:hAnsi="宋体" w:eastAsia="宋体"/>
-            <w:sz w:val="24"/>
-            <w:szCs w:val="24"/>
-            <w:color w:val="111827"/>
-            <w:b/>
-            <w:bCs/>
-            <w:u w:val="none"/>
-          </w:rPr>
-          <w:t xml:space="preserve">七、课程总结</w:t>
-        </w:r>
-      </w:hyperlink>
-      <w:r>
-        <w:tab/>
-      </w:r>
-      <w:hyperlink w:anchor="bm_h_21" w:history="1">
-        <w:r>
-          <w:rPr>
-            <w:rStyle w:val="Hyperlink"/>
-            <w:rFonts w:ascii="宋体" w:hAnsi="宋体" w:eastAsia="宋体"/>
-            <w:sz w:val="24"/>
-            <w:szCs w:val="24"/>
-            <w:color w:val="111827"/>
-            <w:b/>
-            <w:bCs/>
-            <w:u w:val="none"/>
-          </w:rPr>
-          <w:t xml:space="preserve">20</w:t>
-        </w:r>
-      </w:hyperlink>
-    </w:p>
-    <w:p>
-      <w:pPr>
-        <w:tabs>
-          <w:tab w:pos="8391" w:val="right" w:leader="dot"/>
-        </w:tabs>
-        <w:spacing w:line="240" w:lineRule="auto" w:before="80" w:after="120"/>
-        <w:ind w:left="0" w:right="85"/>
-      </w:pPr>
-      <w:hyperlink w:anchor="bm_h_22" w:history="1">
-        <w:r>
-          <w:rPr>
-            <w:rStyle w:val="Hyperlink"/>
-            <w:rFonts w:ascii="宋体" w:hAnsi="宋体" w:eastAsia="宋体"/>
-            <w:sz w:val="24"/>
-            <w:szCs w:val="24"/>
-            <w:color w:val="111827"/>
-            <w:b/>
-            <w:bCs/>
-            <w:u w:val="none"/>
-          </w:rPr>
-          <w:t xml:space="preserve">附录：运行方式</w:t>
-        </w:r>
-      </w:hyperlink>
-      <w:r>
-        <w:tab/>
-      </w:r>
-      <w:hyperlink w:anchor="bm_h_22" w:history="1">
-        <w:r>
-          <w:rPr>
-            <w:rStyle w:val="Hyperlink"/>
-            <w:rFonts w:ascii="宋体" w:hAnsi="宋体" w:eastAsia="宋体"/>
-            <w:sz w:val="24"/>
-            <w:szCs w:val="24"/>
-            <w:color w:val="111827"/>
-            <w:b/>
-            <w:bCs/>
-            <w:u w:val="none"/>
-          </w:rPr>
-          <w:t xml:space="preserve">21</w:t>
-        </w:r>
-      </w:hyperlink>
-    </w:p>
-    <w:p>
-      <w:pPr>
-        <w:tabs>
-          <w:tab w:pos="8391" w:val="right" w:leader="dot"/>
-        </w:tabs>
-        <w:spacing w:line="240" w:lineRule="auto" w:before="40" w:after="80"/>
-        <w:ind w:left="408" w:right="85"/>
-      </w:pPr>
-      <w:hyperlink w:anchor="bm_h_23" w:history="1">
-        <w:r>
-          <w:rPr>
-            <w:rStyle w:val="Hyperlink"/>
-            <w:rFonts w:ascii="宋体" w:hAnsi="宋体" w:eastAsia="宋体"/>
-            <w:sz w:val="24"/>
-            <w:szCs w:val="24"/>
-            <w:color w:val="111827"/>
-            <w:u w:val="none"/>
-          </w:rPr>
-          <w:t xml:space="preserve">附录 A：项目文件与交付物对照</w:t>
-        </w:r>
-      </w:hyperlink>
-      <w:r>
-        <w:tab/>
-      </w:r>
-      <w:hyperlink w:anchor="bm_h_23" w:history="1">
-        <w:r>
-          <w:rPr>
-            <w:rStyle w:val="Hyperlink"/>
-            <w:rFonts w:ascii="宋体" w:hAnsi="宋体" w:eastAsia="宋体"/>
-            <w:sz w:val="24"/>
-            <w:szCs w:val="24"/>
-            <w:color w:val="111827"/>
-            <w:u w:val="none"/>
-          </w:rPr>
-          <w:t xml:space="preserve">21</w:t>
-        </w:r>
-      </w:hyperlink>
-    </w:p>
-    <w:p>
-      <w:pPr>
-        <w:tabs>
-          <w:tab w:pos="8391" w:val="right" w:leader="dot"/>
-        </w:tabs>
-        <w:spacing w:line="240" w:lineRule="auto" w:before="40" w:after="80"/>
-        <w:ind w:left="408" w:right="85"/>
-      </w:pPr>
-      <w:hyperlink w:anchor="bm_h_24" w:history="1">
-        <w:r>
-          <w:rPr>
-            <w:rStyle w:val="Hyperlink"/>
-            <w:rFonts w:ascii="宋体" w:hAnsi="宋体" w:eastAsia="宋体"/>
-            <w:sz w:val="24"/>
-            <w:szCs w:val="24"/>
-            <w:color w:val="111827"/>
-            <w:u w:val="none"/>
-          </w:rPr>
-          <w:t xml:space="preserve">附录 B：关键术语说明</w:t>
-        </w:r>
-      </w:hyperlink>
-      <w:r>
-        <w:tab/>
-      </w:r>
-      <w:hyperlink w:anchor="bm_h_24" w:history="1">
-        <w:r>
-          <w:rPr>
-            <w:rStyle w:val="Hyperlink"/>
-            <w:rFonts w:ascii="宋体" w:hAnsi="宋体" w:eastAsia="宋体"/>
-            <w:sz w:val="24"/>
-            <w:szCs w:val="24"/>
-            <w:color w:val="111827"/>
-            <w:u w:val="none"/>
-          </w:rPr>
-          <w:t xml:space="preserve">22</w:t>
-        </w:r>
-      </w:hyperlink>
     </w:p>
     <w:p>
       <w:r>

</xml_diff>